<commit_message>
Neutralizar plantilla y mejorar graficas del informe
</commit_message>
<xml_diff>
--- a/templates/PLANTILLA_INFORME.docx
+++ b/templates/PLANTILLA_INFORME.docx
@@ -88,7 +88,7 @@
                                 <w:color w:val="000000"/>
                                 <w:sz w:val="28"/>
                               </w:rPr>
-                              <w:t>Ingeniería de Sistemas</w:t>
+                              <w:t>{{PROGRAMA}}</w:t>
                             </w:r>
                           </w:p>
                           <w:p>
@@ -120,7 +120,7 @@
                                 <w:color w:val="000000"/>
                                 <w:sz w:val="28"/>
                               </w:rPr>
-                              <w:t>2026-1</w:t>
+                              <w:t>{{PERIODO}}</w:t>
                             </w:r>
                           </w:p>
                           <w:p>
@@ -273,7 +273,7 @@
                           <w:color w:val="000000"/>
                           <w:sz w:val="28"/>
                         </w:rPr>
-                        <w:t>Ingeniería de Sistemas</w:t>
+                        <w:t>{{PROGRAMA}}</w:t>
                       </w:r>
                     </w:p>
                     <w:p>
@@ -305,7 +305,7 @@
                           <w:color w:val="000000"/>
                           <w:sz w:val="28"/>
                         </w:rPr>
-                        <w:t>2026-1</w:t>
+                        <w:t>{{PERIODO}}</w:t>
                       </w:r>
                     </w:p>
                     <w:p>
@@ -1183,16 +1183,7 @@
         <w:jc w:val="both"/>
       </w:pPr>
       <w:r>
-        <w:t>Durante el semestre 2026-1</w:t>
-      </w:r>
-      <w:r>
-        <w:t xml:space="preserve"> el uso de la plataforma Open LMS se mantiene alto por parte de la Facultad de</w:t>
-      </w:r>
-      <w:r>
-        <w:t xml:space="preserve"> </w:t>
-      </w:r>
-      <w:r>
-        <w:t>Ingeniería de Sistemas. Los cursos con contenido han permitido que los estudiantes puedan mantener una buena interacción con los recursos publicados. Cabe destacar que durante este semestre lograron llegar a utilizar la totalidad de los cursos habilitados en plataforma (100%).</w:t>
+        <w:t>Durante el semestre {{PERIODO}}. {{RESUMEN_EJECUTIVO}}</w:t>
       </w:r>
     </w:p>
     <w:p>
@@ -1270,12 +1261,7 @@
             <w:tcW w:type="dxa" w:w="3360"/>
           </w:tcPr>
           <w:p>
-            <w:r>
-              <w:rPr>
-                <w:sz w:val="16"/>
-              </w:rPr>
-              <w:t>Eventos totales</w:t>
-            </w:r>
+            <w:r/>
           </w:p>
         </w:tc>
         <w:tc>
@@ -1283,12 +1269,7 @@
             <w:tcW w:type="dxa" w:w="3360"/>
           </w:tcPr>
           <w:p>
-            <w:r>
-              <w:rPr>
-                <w:sz w:val="16"/>
-              </w:rPr>
-              <w:t>400.568</w:t>
-            </w:r>
+            <w:r/>
           </w:p>
         </w:tc>
         <w:tc>
@@ -1296,12 +1277,7 @@
             <w:tcW w:type="dxa" w:w="3360"/>
           </w:tcPr>
           <w:p>
-            <w:r>
-              <w:rPr>
-                <w:sz w:val="16"/>
-              </w:rPr>
-              <w:t>Interacciones registradas por Open LMS</w:t>
-            </w:r>
+            <w:r/>
           </w:p>
         </w:tc>
       </w:tr>
@@ -1312,12 +1288,7 @@
             <w:shd w:fill="EAF2F8"/>
           </w:tcPr>
           <w:p>
-            <w:r>
-              <w:rPr>
-                <w:sz w:val="16"/>
-              </w:rPr>
-              <w:t>Usuarios únicos</w:t>
-            </w:r>
+            <w:r/>
           </w:p>
         </w:tc>
         <w:tc>
@@ -1326,12 +1297,7 @@
             <w:shd w:fill="EAF2F8"/>
           </w:tcPr>
           <w:p>
-            <w:r>
-              <w:rPr>
-                <w:sz w:val="16"/>
-              </w:rPr>
-              <w:t>520</w:t>
-            </w:r>
+            <w:r/>
           </w:p>
         </w:tc>
         <w:tc>
@@ -1340,12 +1306,7 @@
             <w:shd w:fill="EAF2F8"/>
           </w:tcPr>
           <w:p>
-            <w:r>
-              <w:rPr>
-                <w:sz w:val="16"/>
-              </w:rPr>
-              <w:t>509 estudiantes y 11 docentes</w:t>
-            </w:r>
+            <w:r/>
           </w:p>
         </w:tc>
       </w:tr>
@@ -1355,12 +1316,7 @@
             <w:tcW w:type="dxa" w:w="3360"/>
           </w:tcPr>
           <w:p>
-            <w:r>
-              <w:rPr>
-                <w:sz w:val="16"/>
-              </w:rPr>
-              <w:t>Actividad estudiantil</w:t>
-            </w:r>
+            <w:r/>
           </w:p>
         </w:tc>
         <w:tc>
@@ -1368,12 +1324,7 @@
             <w:tcW w:type="dxa" w:w="3360"/>
           </w:tcPr>
           <w:p>
-            <w:r>
-              <w:rPr>
-                <w:sz w:val="16"/>
-              </w:rPr>
-              <w:t>323.790 eventos</w:t>
-            </w:r>
+            <w:r/>
           </w:p>
         </w:tc>
         <w:tc>
@@ -1381,12 +1332,7 @@
             <w:tcW w:type="dxa" w:w="3360"/>
           </w:tcPr>
           <w:p>
-            <w:r>
-              <w:rPr>
-                <w:sz w:val="16"/>
-              </w:rPr>
-              <w:t>80,8 % del total</w:t>
-            </w:r>
+            <w:r/>
           </w:p>
         </w:tc>
       </w:tr>
@@ -1397,12 +1343,7 @@
             <w:shd w:fill="EAF2F8"/>
           </w:tcPr>
           <w:p>
-            <w:r>
-              <w:rPr>
-                <w:sz w:val="16"/>
-              </w:rPr>
-              <w:t>Actividad docente</w:t>
-            </w:r>
+            <w:r/>
           </w:p>
         </w:tc>
         <w:tc>
@@ -1411,12 +1352,7 @@
             <w:shd w:fill="EAF2F8"/>
           </w:tcPr>
           <w:p>
-            <w:r>
-              <w:rPr>
-                <w:sz w:val="16"/>
-              </w:rPr>
-              <w:t>76.778 eventos</w:t>
-            </w:r>
+            <w:r/>
           </w:p>
         </w:tc>
         <w:tc>
@@ -1425,12 +1361,7 @@
             <w:shd w:fill="EAF2F8"/>
           </w:tcPr>
           <w:p>
-            <w:r>
-              <w:rPr>
-                <w:sz w:val="16"/>
-              </w:rPr>
-              <w:t>19,2 % del total</w:t>
-            </w:r>
+            <w:r/>
           </w:p>
         </w:tc>
       </w:tr>
@@ -1440,12 +1371,7 @@
             <w:tcW w:type="dxa" w:w="3360"/>
           </w:tcPr>
           <w:p>
-            <w:r>
-              <w:rPr>
-                <w:sz w:val="16"/>
-              </w:rPr>
-              <w:t>Días activos por estudiante</w:t>
-            </w:r>
+            <w:r/>
           </w:p>
         </w:tc>
         <w:tc>
@@ -1453,12 +1379,7 @@
             <w:tcW w:type="dxa" w:w="3360"/>
           </w:tcPr>
           <w:p>
-            <w:r>
-              <w:rPr>
-                <w:sz w:val="16"/>
-              </w:rPr>
-              <w:t>39,1 promedio</w:t>
-            </w:r>
+            <w:r/>
           </w:p>
         </w:tc>
         <w:tc>
@@ -1466,12 +1387,7 @@
             <w:tcW w:type="dxa" w:w="3360"/>
           </w:tcPr>
           <w:p>
-            <w:r>
-              <w:rPr>
-                <w:sz w:val="16"/>
-              </w:rPr>
-              <w:t>Mediana: 38 días</w:t>
-            </w:r>
+            <w:r/>
           </w:p>
         </w:tc>
       </w:tr>
@@ -1482,12 +1398,7 @@
             <w:shd w:fill="EAF2F8"/>
           </w:tcPr>
           <w:p>
-            <w:r>
-              <w:rPr>
-                <w:sz w:val="16"/>
-              </w:rPr>
-              <w:t>Días activos por docente</w:t>
-            </w:r>
+            <w:r/>
           </w:p>
         </w:tc>
         <w:tc>
@@ -1496,12 +1407,7 @@
             <w:shd w:fill="EAF2F8"/>
           </w:tcPr>
           <w:p>
-            <w:r>
-              <w:rPr>
-                <w:sz w:val="16"/>
-              </w:rPr>
-              <w:t>71,4 promedio</w:t>
-            </w:r>
+            <w:r/>
           </w:p>
         </w:tc>
         <w:tc>
@@ -1510,12 +1416,7 @@
             <w:shd w:fill="EAF2F8"/>
           </w:tcPr>
           <w:p>
-            <w:r>
-              <w:rPr>
-                <w:sz w:val="16"/>
-              </w:rPr>
-              <w:t>Mediana: 75 días</w:t>
-            </w:r>
+            <w:r/>
           </w:p>
         </w:tc>
       </w:tr>
@@ -1552,34 +1453,7 @@
         <w:jc w:val="both"/>
       </w:pPr>
       <w:r>
-        <w:t xml:space="preserve">Este informe estadístico del uso de la plataforma Open LMS de la Universidad Santo Tomás Seccional Tunja, para </w:t>
-      </w:r>
-      <w:r>
-        <w:t xml:space="preserve">la </w:t>
-      </w:r>
-      <w:r>
-        <w:t>F</w:t>
-      </w:r>
-      <w:r>
-        <w:t xml:space="preserve">acultad </w:t>
-      </w:r>
-      <w:r>
-        <w:t>Ingeniería de Sistemas</w:t>
-      </w:r>
-      <w:r>
-        <w:t xml:space="preserve"> para el periodo </w:t>
-      </w:r>
-      <w:r>
-        <w:t>2026</w:t>
-      </w:r>
-      <w:r>
-        <w:t>-</w:t>
-      </w:r>
-      <w:r>
-        <w:t>1</w:t>
-      </w:r>
-      <w:r>
-        <w:t>, fue elaborado por el equipo del Campus Virtual.</w:t>
+        <w:t>Este informe institucional corresponde a {{PROGRAMA}}. {{INTRODUCCION}}</w:t>
       </w:r>
     </w:p>
     <w:p>
@@ -1587,49 +1461,7 @@
         <w:jc w:val="both"/>
       </w:pPr>
       <w:r>
-        <w:t xml:space="preserve">Para la elaboración del informe se aplicaron procesos de analítica sobre </w:t>
-      </w:r>
-      <w:r>
-        <w:t>400.568</w:t>
-      </w:r>
-      <w:r>
-        <w:t xml:space="preserve"> registros de datos obtenidos del sistema de seguimiento de participantes del Campus Virtual </w:t>
-      </w:r>
-      <w:r>
-        <w:t>USTA Tunja (generados entre el 2</w:t>
-      </w:r>
-      <w:r>
-        <w:t xml:space="preserve"> de </w:t>
-      </w:r>
-      <w:r>
-        <w:t>febrero</w:t>
-      </w:r>
-      <w:r>
-        <w:t xml:space="preserve"> </w:t>
-      </w:r>
-      <w:r>
-        <w:t xml:space="preserve">y el </w:t>
-      </w:r>
-      <w:r>
-        <w:t>30</w:t>
-      </w:r>
-      <w:r>
-        <w:t xml:space="preserve"> de </w:t>
-      </w:r>
-      <w:r>
-        <w:t>junio</w:t>
-      </w:r>
-      <w:r>
-        <w:t xml:space="preserve"> </w:t>
-      </w:r>
-      <w:r>
-        <w:t>de 202</w:t>
-      </w:r>
-      <w:r>
-        <w:t>6</w:t>
-      </w:r>
-      <w:r>
-        <w:t>). Se utilizaron herramientas para el procesamiento y analítica de datos como Microsoft Excel.</w:t>
+        <w:t>Para la elaboración del informe: {{METODOLOGIA_DATOS}}</w:t>
       </w:r>
     </w:p>
     <w:p>
@@ -1814,13 +1646,7 @@
         <w:jc w:val="both"/>
       </w:pPr>
       <w:r>
-        <w:t xml:space="preserve">Este informe podrá ser remitido a los líderes de las facultades, departamentos o unidades académicas y adjunto se remitirá un archivo de Excel con los registros al detalle de la actividad de los docentes y estudiantes de su respectiva área. La estructura de estos archivos tiene </w:t>
-      </w:r>
-      <w:r>
-        <w:t>10</w:t>
-      </w:r>
-      <w:r>
-        <w:t xml:space="preserve"> hojas electrónicas, que se listan a continuación:</w:t>
+        <w:t>{{DESCRIPCION_HOJAS}}</w:t>
       </w:r>
     </w:p>
     <w:p>
@@ -1828,24 +1654,7 @@
         <w:jc w:val="both"/>
       </w:pPr>
       <w:r>
-        <w:t>1. Hoja de datos obtenidos directamente desde el sistema de seguimiento del Campus Virtual, cuyo nombre es “</w:t>
-      </w:r>
-      <w:r>
-        <w:rPr>
-          <w:b/>
-          <w:i/>
-        </w:rPr>
-        <w:t>O</w:t>
-      </w:r>
-      <w:r>
-        <w:rPr>
-          <w:b/>
-          <w:i/>
-        </w:rPr>
-        <w:t>riginal”</w:t>
-      </w:r>
-      <w:r>
-        <w:t>.</w:t>
+        <w:t>{{HOJA_1}}</w:t>
       </w:r>
     </w:p>
     <w:p>
@@ -1853,65 +1662,7 @@
         <w:jc w:val="both"/>
       </w:pPr>
       <w:r>
-        <w:t>2. Hoja “</w:t>
-      </w:r>
-      <w:r>
-        <w:rPr>
-          <w:b/>
-          <w:i/>
-        </w:rPr>
-        <w:t xml:space="preserve">Tabla </w:t>
-      </w:r>
-      <w:r>
-        <w:rPr>
-          <w:b/>
-          <w:i/>
-        </w:rPr>
-        <w:t>D</w:t>
-      </w:r>
-      <w:r>
-        <w:rPr>
-          <w:b/>
-          <w:i/>
-        </w:rPr>
-        <w:t>inámica</w:t>
-      </w:r>
-      <w:r>
-        <w:rPr>
-          <w:b/>
-          <w:i/>
-        </w:rPr>
-        <w:t xml:space="preserve"> </w:t>
-      </w:r>
-      <w:r>
-        <w:rPr>
-          <w:b/>
-          <w:i/>
-        </w:rPr>
-        <w:t>D</w:t>
-      </w:r>
-      <w:r>
-        <w:rPr>
-          <w:b/>
-          <w:i/>
-        </w:rPr>
-        <w:t>ocente</w:t>
-      </w:r>
-      <w:r>
-        <w:rPr>
-          <w:b/>
-          <w:i/>
-        </w:rPr>
-        <w:t>s</w:t>
-      </w:r>
-      <w:r>
-        <w:t xml:space="preserve">” contiene una tabla dinámica de la hoja 1, discrimina la actividad </w:t>
-      </w:r>
-      <w:r>
-        <w:t xml:space="preserve">docente </w:t>
-      </w:r>
-      <w:r>
-        <w:t>de su respectiva área.</w:t>
+        <w:t>{{HOJA_2}}</w:t>
       </w:r>
     </w:p>
     <w:p>
@@ -1919,28 +1670,7 @@
         <w:jc w:val="both"/>
       </w:pPr>
       <w:r>
-        <w:lastRenderedPageBreak/>
-        <w:t>3. Hoja “</w:t>
-      </w:r>
-      <w:r>
-        <w:rPr>
-          <w:b/>
-          <w:i/>
-        </w:rPr>
-        <w:t>Docentes</w:t>
-      </w:r>
-      <w:r>
-        <w:t xml:space="preserve">” es la misma hoja </w:t>
-      </w:r>
-      <w:r>
-        <w:rPr>
-          <w:b/>
-          <w:i/>
-        </w:rPr>
-        <w:t>Tabla dinámica docente</w:t>
-      </w:r>
-      <w:r>
-        <w:t>, pero los datos están formateados y más fáciles de interpretar. Se recomienda la consulta sobre esta hoja.</w:t>
+        <w:t>{{HOJA_3}}</w:t>
       </w:r>
     </w:p>
     <w:p>
@@ -1948,27 +1678,7 @@
         <w:jc w:val="both"/>
       </w:pPr>
       <w:r>
-        <w:t>4. Hoja “</w:t>
-      </w:r>
-      <w:r>
-        <w:rPr>
-          <w:b/>
-          <w:i/>
-        </w:rPr>
-        <w:t>Docentes DG</w:t>
-      </w:r>
-      <w:r>
-        <w:t xml:space="preserve">” es la interpretación gráfica de la hoja </w:t>
-      </w:r>
-      <w:r>
-        <w:rPr>
-          <w:b/>
-          <w:i/>
-        </w:rPr>
-        <w:t>Docentes D</w:t>
-      </w:r>
-      <w:r>
-        <w:t>, para días al mes de uso del Campus Virtual, por parte de los docentes.</w:t>
+        <w:t>{{HOJA_4}}</w:t>
       </w:r>
     </w:p>
     <w:p>
@@ -1976,48 +1686,7 @@
         <w:jc w:val="both"/>
       </w:pPr>
       <w:r>
-        <w:t>5</w:t>
-      </w:r>
-      <w:r>
-        <w:t>. Hoja “</w:t>
-      </w:r>
-      <w:r>
-        <w:rPr>
-          <w:b/>
-          <w:i/>
-        </w:rPr>
-        <w:t xml:space="preserve">Tabla </w:t>
-      </w:r>
-      <w:r>
-        <w:rPr>
-          <w:b/>
-          <w:i/>
-        </w:rPr>
-        <w:t>Di</w:t>
-      </w:r>
-      <w:r>
-        <w:rPr>
-          <w:b/>
-          <w:i/>
-        </w:rPr>
-        <w:t xml:space="preserve">námica </w:t>
-      </w:r>
-      <w:r>
-        <w:rPr>
-          <w:b/>
-          <w:i/>
-        </w:rPr>
-        <w:t>E</w:t>
-      </w:r>
-      <w:r>
-        <w:rPr>
-          <w:b/>
-          <w:i/>
-        </w:rPr>
-        <w:t>studiante</w:t>
-      </w:r>
-      <w:r>
-        <w:t>” contiene una tabla dinámica de la hoja 1, discrimina la actividad estudiante de su respectiva área.</w:t>
+        <w:t>{{HOJA_5}}</w:t>
       </w:r>
     </w:p>
     <w:p>
@@ -2025,37 +1694,7 @@
         <w:jc w:val="both"/>
       </w:pPr>
       <w:r>
-        <w:t>6</w:t>
-      </w:r>
-      <w:r>
-        <w:t>. Hoja “</w:t>
-      </w:r>
-      <w:r>
-        <w:rPr>
-          <w:b/>
-          <w:i/>
-        </w:rPr>
-        <w:t>Estudiantes</w:t>
-      </w:r>
-      <w:r>
-        <w:t xml:space="preserve">” es la misma hoja </w:t>
-      </w:r>
-      <w:r>
-        <w:rPr>
-          <w:b/>
-          <w:i/>
-        </w:rPr>
-        <w:t>Tabla dinámica</w:t>
-      </w:r>
-      <w:r>
-        <w:rPr>
-          <w:b/>
-          <w:i/>
-        </w:rPr>
-        <w:t xml:space="preserve"> estudiante</w:t>
-      </w:r>
-      <w:r>
-        <w:t>, pero los datos están formateados y más fáciles de interpretar. Se recomienda la consulta sobre esta hoja.</w:t>
+        <w:t>{{HOJA_6}}</w:t>
       </w:r>
     </w:p>
     <w:p>
@@ -2067,44 +1706,7 @@
         </w:rPr>
       </w:pPr>
       <w:r>
-        <w:t>7</w:t>
-      </w:r>
-      <w:r>
-        <w:t>. Hoja “</w:t>
-      </w:r>
-      <w:r>
-        <w:rPr>
-          <w:b/>
-          <w:i/>
-        </w:rPr>
-        <w:t xml:space="preserve">Estudiantes </w:t>
-      </w:r>
-      <w:r>
-        <w:rPr>
-          <w:b/>
-          <w:i/>
-        </w:rPr>
-        <w:t>D</w:t>
-      </w:r>
-      <w:r>
-        <w:rPr>
-          <w:b/>
-          <w:i/>
-        </w:rPr>
-        <w:t>G</w:t>
-      </w:r>
-      <w:r>
-        <w:t xml:space="preserve">” es la interpretación gráfica de la hoja </w:t>
-      </w:r>
-      <w:r>
-        <w:rPr>
-          <w:b/>
-          <w:i/>
-        </w:rPr>
-        <w:t>Estudiantes D</w:t>
-      </w:r>
-      <w:r>
-        <w:t>, para días al mes de uso del Campus Virtual, por parte de los estudiantes.</w:t>
+        <w:t>{{HOJA_7}}</w:t>
       </w:r>
     </w:p>
     <w:p>
@@ -2112,44 +1714,7 @@
         <w:jc w:val="both"/>
       </w:pPr>
       <w:r>
-        <w:t>8</w:t>
-      </w:r>
-      <w:r>
-        <w:t>. Hoja “</w:t>
-      </w:r>
-      <w:r>
-        <w:rPr>
-          <w:b/>
-          <w:i/>
-        </w:rPr>
-        <w:t xml:space="preserve">Estudiantes </w:t>
-      </w:r>
-      <w:r>
-        <w:rPr>
-          <w:b/>
-          <w:i/>
-        </w:rPr>
-        <w:t>D</w:t>
-      </w:r>
-      <w:r>
-        <w:rPr>
-          <w:b/>
-          <w:i/>
-        </w:rPr>
-        <w:t>G2</w:t>
-      </w:r>
-      <w:r>
-        <w:t xml:space="preserve">” es la interpretación gráfica de la hoja </w:t>
-      </w:r>
-      <w:r>
-        <w:rPr>
-          <w:b/>
-          <w:i/>
-        </w:rPr>
-        <w:t>Estudiantes D</w:t>
-      </w:r>
-      <w:r>
-        <w:t>, para cantidad promedio de estudiantes por curso que usaron el Campus Virtual.</w:t>
+        <w:t>{{HOJA_8}}</w:t>
       </w:r>
     </w:p>
     <w:p>
@@ -2157,44 +1722,7 @@
         <w:jc w:val="both"/>
       </w:pPr>
       <w:r>
-        <w:t>9. Hoja “</w:t>
-      </w:r>
-      <w:r>
-        <w:rPr>
-          <w:b/>
-          <w:i/>
-        </w:rPr>
-        <w:t xml:space="preserve">Tabla </w:t>
-      </w:r>
-      <w:r>
-        <w:rPr>
-          <w:b/>
-          <w:i/>
-        </w:rPr>
-        <w:t>D</w:t>
-      </w:r>
-      <w:r>
-        <w:rPr>
-          <w:b/>
-          <w:i/>
-        </w:rPr>
-        <w:t>inámica Actividad</w:t>
-      </w:r>
-      <w:r>
-        <w:rPr>
-          <w:b/>
-          <w:i/>
-        </w:rPr>
-        <w:t>es</w:t>
-      </w:r>
-      <w:r>
-        <w:t xml:space="preserve">” contiene una tabla dinámica de la hoja 1, discrimina </w:t>
-      </w:r>
-      <w:r>
-        <w:t>las cantidades de acciones</w:t>
-      </w:r>
-      <w:r>
-        <w:t xml:space="preserve"> realizadas de cada área respectiva.</w:t>
+        <w:t>{{HOJA_9}}</w:t>
       </w:r>
     </w:p>
     <w:p>
@@ -2202,37 +1730,7 @@
         <w:jc w:val="both"/>
       </w:pPr>
       <w:r>
-        <w:t>10</w:t>
-      </w:r>
-      <w:r>
-        <w:t>. Hoja “</w:t>
-      </w:r>
-      <w:r>
-        <w:rPr>
-          <w:b/>
-          <w:i/>
-        </w:rPr>
-        <w:t xml:space="preserve">Diseño </w:t>
-      </w:r>
-      <w:r>
-        <w:rPr>
-          <w:b/>
-          <w:i/>
-        </w:rPr>
-        <w:t>de C</w:t>
-      </w:r>
-      <w:r>
-        <w:rPr>
-          <w:b/>
-          <w:i/>
-        </w:rPr>
-        <w:t>ursos</w:t>
-      </w:r>
-      <w:r>
-        <w:t>” contiene la información sobre la cantidad de cursos vacíos y con contenido en la categoría de la facultad.</w:t>
-      </w:r>
-      <w:r>
-        <w:br w:type="page"/>
+        <w:t>{{HOJA_10}}</w:t>
       </w:r>
     </w:p>
     <w:p>
@@ -2245,7 +1743,7 @@
     </w:p>
     <w:p>
       <w:r>
-        <w:t>La actividad se concentró principalmente en marzo y mayo. La tabla permite comparar el volumen de eventos con la cantidad de estudiantes activos; junio debe interpretarse según la fecha de corte y el cierre del semestre.</w:t>
+        <w:t>{{ANALISIS_MENSUAL}}</w:t>
       </w:r>
     </w:p>
     <w:p>
@@ -2257,7 +1755,7 @@
         <w:drawing>
           <wp:inline xmlns:a="http://schemas.openxmlformats.org/drawingml/2006/main" xmlns:pic="http://schemas.openxmlformats.org/drawingml/2006/picture">
             <wp:extent cx="6080760" cy="3175508"/>
-            <wp:docPr id="223" name="Picture 223"/>
+            <wp:docPr id="225" name="Picture 225"/>
             <wp:cNvGraphicFramePr>
               <a:graphicFrameLocks noChangeAspect="1"/>
             </wp:cNvGraphicFramePr>
@@ -2265,11 +1763,11 @@
               <a:graphicData uri="http://schemas.openxmlformats.org/drawingml/2006/picture">
                 <pic:pic>
                   <pic:nvPicPr>
-                    <pic:cNvPr id="0" name="eventos_mensuales.png"/>
+                    <pic:cNvPr id="0" name="grafica_1.png"/>
                     <pic:cNvPicPr/>
                   </pic:nvPicPr>
                   <pic:blipFill>
-                    <a:blip r:embed="rId17"/>
+                    <a:blip r:embed="rId19"/>
                     <a:stretch>
                       <a:fillRect/>
                     </a:stretch>
@@ -2293,12 +1791,7 @@
         <w:jc w:val="center"/>
       </w:pPr>
       <w:r>
-        <w:rPr>
-          <w:i/>
-          <w:color w:val="5B6573"/>
-          <w:sz w:val="17"/>
-        </w:rPr>
-        <w:t>Ilustración 1. Eventos mensuales por tipo de usuario. Fuente: registros originales de Open LMS.</w:t>
+        <w:t>Ilustración 1. {{TITULO_GRAFICA_1}}</w:t>
       </w:r>
     </w:p>
     <w:tbl>
@@ -2385,12 +1878,7 @@
             <w:tcW w:type="dxa" w:w="2520"/>
           </w:tcPr>
           <w:p>
-            <w:r>
-              <w:rPr>
-                <w:sz w:val="16"/>
-              </w:rPr>
-              <w:t>Febrero</w:t>
-            </w:r>
+            <w:r/>
           </w:p>
         </w:tc>
         <w:tc>
@@ -2398,12 +1886,7 @@
             <w:tcW w:type="dxa" w:w="2520"/>
           </w:tcPr>
           <w:p>
-            <w:r>
-              <w:rPr>
-                <w:sz w:val="16"/>
-              </w:rPr>
-              <w:t>56.480</w:t>
-            </w:r>
+            <w:r/>
           </w:p>
         </w:tc>
         <w:tc>
@@ -2411,12 +1894,7 @@
             <w:tcW w:type="dxa" w:w="2520"/>
           </w:tcPr>
           <w:p>
-            <w:r>
-              <w:rPr>
-                <w:sz w:val="16"/>
-              </w:rPr>
-              <w:t>497</w:t>
-            </w:r>
+            <w:r/>
           </w:p>
         </w:tc>
         <w:tc>
@@ -2424,12 +1902,7 @@
             <w:tcW w:type="dxa" w:w="2520"/>
           </w:tcPr>
           <w:p>
-            <w:r>
-              <w:rPr>
-                <w:sz w:val="16"/>
-              </w:rPr>
-              <w:t>12.400</w:t>
-            </w:r>
+            <w:r/>
           </w:p>
         </w:tc>
       </w:tr>
@@ -2440,12 +1913,7 @@
             <w:shd w:fill="EAF2F8"/>
           </w:tcPr>
           <w:p>
-            <w:r>
-              <w:rPr>
-                <w:sz w:val="16"/>
-              </w:rPr>
-              <w:t>Marzo</w:t>
-            </w:r>
+            <w:r/>
           </w:p>
         </w:tc>
         <w:tc>
@@ -2454,12 +1922,7 @@
             <w:shd w:fill="EAF2F8"/>
           </w:tcPr>
           <w:p>
-            <w:r>
-              <w:rPr>
-                <w:sz w:val="16"/>
-              </w:rPr>
-              <w:t>106.884</w:t>
-            </w:r>
+            <w:r/>
           </w:p>
         </w:tc>
         <w:tc>
@@ -2468,12 +1931,7 @@
             <w:shd w:fill="EAF2F8"/>
           </w:tcPr>
           <w:p>
-            <w:r>
-              <w:rPr>
-                <w:sz w:val="16"/>
-              </w:rPr>
-              <w:t>503</w:t>
-            </w:r>
+            <w:r/>
           </w:p>
         </w:tc>
         <w:tc>
@@ -2482,12 +1940,7 @@
             <w:shd w:fill="EAF2F8"/>
           </w:tcPr>
           <w:p>
-            <w:r>
-              <w:rPr>
-                <w:sz w:val="16"/>
-              </w:rPr>
-              <w:t>25.256</w:t>
-            </w:r>
+            <w:r/>
           </w:p>
         </w:tc>
       </w:tr>
@@ -2497,12 +1950,7 @@
             <w:tcW w:type="dxa" w:w="2520"/>
           </w:tcPr>
           <w:p>
-            <w:r>
-              <w:rPr>
-                <w:sz w:val="16"/>
-              </w:rPr>
-              <w:t>Abril</w:t>
-            </w:r>
+            <w:r/>
           </w:p>
         </w:tc>
         <w:tc>
@@ -2510,12 +1958,7 @@
             <w:tcW w:type="dxa" w:w="2520"/>
           </w:tcPr>
           <w:p>
-            <w:r>
-              <w:rPr>
-                <w:sz w:val="16"/>
-              </w:rPr>
-              <w:t>64.000</w:t>
-            </w:r>
+            <w:r/>
           </w:p>
         </w:tc>
         <w:tc>
@@ -2523,12 +1966,7 @@
             <w:tcW w:type="dxa" w:w="2520"/>
           </w:tcPr>
           <w:p>
-            <w:r>
-              <w:rPr>
-                <w:sz w:val="16"/>
-              </w:rPr>
-              <w:t>500</w:t>
-            </w:r>
+            <w:r/>
           </w:p>
         </w:tc>
         <w:tc>
@@ -2536,12 +1974,7 @@
             <w:tcW w:type="dxa" w:w="2520"/>
           </w:tcPr>
           <w:p>
-            <w:r>
-              <w:rPr>
-                <w:sz w:val="16"/>
-              </w:rPr>
-              <w:t>12.586</w:t>
-            </w:r>
+            <w:r/>
           </w:p>
         </w:tc>
       </w:tr>
@@ -2552,12 +1985,7 @@
             <w:shd w:fill="EAF2F8"/>
           </w:tcPr>
           <w:p>
-            <w:r>
-              <w:rPr>
-                <w:sz w:val="16"/>
-              </w:rPr>
-              <w:t>Mayo</w:t>
-            </w:r>
+            <w:r/>
           </w:p>
         </w:tc>
         <w:tc>
@@ -2566,12 +1994,7 @@
             <w:shd w:fill="EAF2F8"/>
           </w:tcPr>
           <w:p>
-            <w:r>
-              <w:rPr>
-                <w:sz w:val="16"/>
-              </w:rPr>
-              <w:t>93.527</w:t>
-            </w:r>
+            <w:r/>
           </w:p>
         </w:tc>
         <w:tc>
@@ -2580,12 +2003,7 @@
             <w:shd w:fill="EAF2F8"/>
           </w:tcPr>
           <w:p>
-            <w:r>
-              <w:rPr>
-                <w:sz w:val="16"/>
-              </w:rPr>
-              <w:t>499</w:t>
-            </w:r>
+            <w:r/>
           </w:p>
         </w:tc>
         <w:tc>
@@ -2594,12 +2012,7 @@
             <w:shd w:fill="EAF2F8"/>
           </w:tcPr>
           <w:p>
-            <w:r>
-              <w:rPr>
-                <w:sz w:val="16"/>
-              </w:rPr>
-              <w:t>23.198</w:t>
-            </w:r>
+            <w:r/>
           </w:p>
         </w:tc>
       </w:tr>
@@ -2609,12 +2022,7 @@
             <w:tcW w:type="dxa" w:w="2520"/>
           </w:tcPr>
           <w:p>
-            <w:r>
-              <w:rPr>
-                <w:sz w:val="16"/>
-              </w:rPr>
-              <w:t>Junio</w:t>
-            </w:r>
+            <w:r/>
           </w:p>
         </w:tc>
         <w:tc>
@@ -2622,12 +2030,7 @@
             <w:tcW w:type="dxa" w:w="2520"/>
           </w:tcPr>
           <w:p>
-            <w:r>
-              <w:rPr>
-                <w:sz w:val="16"/>
-              </w:rPr>
-              <w:t>2.899</w:t>
-            </w:r>
+            <w:r/>
           </w:p>
         </w:tc>
         <w:tc>
@@ -2635,12 +2038,7 @@
             <w:tcW w:type="dxa" w:w="2520"/>
           </w:tcPr>
           <w:p>
-            <w:r>
-              <w:rPr>
-                <w:sz w:val="16"/>
-              </w:rPr>
-              <w:t>141</w:t>
-            </w:r>
+            <w:r/>
           </w:p>
         </w:tc>
         <w:tc>
@@ -2648,12 +2046,7 @@
             <w:tcW w:type="dxa" w:w="2520"/>
           </w:tcPr>
           <w:p>
-            <w:r>
-              <w:rPr>
-                <w:sz w:val="16"/>
-              </w:rPr>
-              <w:t>3.338</w:t>
-            </w:r>
+            <w:r/>
           </w:p>
         </w:tc>
       </w:tr>
@@ -2678,48 +2071,7 @@
         <w:jc w:val="both"/>
       </w:pPr>
       <w:r>
-        <w:t xml:space="preserve">Con un uso que va entre </w:t>
-      </w:r>
-      <w:r>
-        <w:t>3</w:t>
-      </w:r>
-      <w:r>
-        <w:t xml:space="preserve"> a </w:t>
-      </w:r>
-      <w:r>
-        <w:t>18</w:t>
-      </w:r>
-      <w:r>
-        <w:t xml:space="preserve"> días al mes, los docentes </w:t>
-      </w:r>
-      <w:r>
-        <w:t>d</w:t>
-      </w:r>
-      <w:r>
-        <w:t xml:space="preserve">e la </w:t>
-      </w:r>
-      <w:r>
-        <w:t xml:space="preserve">facultad </w:t>
-      </w:r>
-      <w:r>
-        <w:t>Ingeniería de Sistemas</w:t>
-      </w:r>
-      <w:bookmarkStart w:id="3" w:name="OLE_LINK49"/>
-      <w:r>
-        <w:t xml:space="preserve"> </w:t>
-      </w:r>
-      <w:bookmarkEnd w:id="3"/>
-      <w:r>
-        <w:t xml:space="preserve">presentan un uso </w:t>
-      </w:r>
-      <w:r>
-        <w:t>alto</w:t>
-      </w:r>
-      <w:r>
-        <w:t xml:space="preserve"> </w:t>
-      </w:r>
-      <w:r>
-        <w:t xml:space="preserve">de plataforma. Los docentes destacados son: </w:t>
+        <w:t>{{ANALISIS_DOCENTES}}</w:t>
       </w:r>
     </w:p>
     <w:p>
@@ -2739,72 +2091,7 @@
         <w:jc w:val="both"/>
       </w:pPr>
       <w:r>
-        <w:rPr>
-          <w:color w:val="000000"/>
-        </w:rPr>
-        <w:t>ANDREA CRUZ YOMAYUSA</w:t>
-      </w:r>
-      <w:r>
-        <w:rPr>
-          <w:color w:val="000000"/>
-        </w:rPr>
-        <w:t xml:space="preserve"> </w:t>
-      </w:r>
-      <w:r>
-        <w:rPr>
-          <w:color w:val="000000"/>
-        </w:rPr>
-        <w:t xml:space="preserve">la asignatura </w:t>
-      </w:r>
-      <w:r>
-        <w:rPr>
-          <w:b/>
-          <w:bCs/>
-        </w:rPr>
-        <w:t>OPTIMIZACION_6A_6B</w:t>
-      </w:r>
-      <w:r>
-        <w:rPr>
-          <w:b/>
-          <w:bCs/>
-        </w:rPr>
-        <w:t xml:space="preserve"> </w:t>
-      </w:r>
-      <w:r>
-        <w:rPr>
-          <w:color w:val="000000"/>
-        </w:rPr>
-        <w:t xml:space="preserve">con </w:t>
-      </w:r>
-      <w:r>
-        <w:rPr>
-          <w:color w:val="000000"/>
-        </w:rPr>
-        <w:t>67</w:t>
-      </w:r>
-      <w:r>
-        <w:rPr>
-          <w:color w:val="000000"/>
-        </w:rPr>
-        <w:t xml:space="preserve"> </w:t>
-      </w:r>
-      <w:r>
-        <w:rPr>
-          <w:color w:val="000000"/>
-        </w:rPr>
-        <w:t xml:space="preserve">accesos </w:t>
-      </w:r>
-      <w:r>
-        <w:rPr>
-          <w:color w:val="000000"/>
-        </w:rPr>
-        <w:t xml:space="preserve">cada uno </w:t>
-      </w:r>
-      <w:r>
-        <w:rPr>
-          <w:color w:val="000000"/>
-        </w:rPr>
-        <w:t>durante el semestre.</w:t>
+        <w:t>{{DOCENTE_1}}</w:t>
       </w:r>
     </w:p>
     <w:p>
@@ -2824,55 +2111,7 @@
         <w:jc w:val="both"/>
       </w:pPr>
       <w:r>
-        <w:rPr>
-          <w:color w:val="000000"/>
-        </w:rPr>
-        <w:t>ANDREA CRUZ YOMAYUSA</w:t>
-      </w:r>
-      <w:r>
-        <w:rPr>
-          <w:color w:val="000000"/>
-        </w:rPr>
-        <w:t xml:space="preserve"> </w:t>
-      </w:r>
-      <w:r>
-        <w:rPr>
-          <w:color w:val="000000"/>
-        </w:rPr>
-        <w:t xml:space="preserve">en la asignatura </w:t>
-      </w:r>
-      <w:r>
-        <w:rPr>
-          <w:b/>
-          <w:bCs/>
-        </w:rPr>
-        <w:t>OPTIMI</w:t>
-      </w:r>
-      <w:r>
-        <w:rPr>
-          <w:b/>
-          <w:bCs/>
-        </w:rPr>
-        <w:t>INTRODUCCION A LA INGENIERIA DE SISTEMAS_1A</w:t>
-      </w:r>
-      <w:r>
-        <w:rPr>
-          <w:b/>
-          <w:bCs/>
-        </w:rPr>
-        <w:t xml:space="preserve"> </w:t>
-      </w:r>
-      <w:r>
-        <w:rPr>
-          <w:color w:val="000000"/>
-        </w:rPr>
-        <w:t>con 59</w:t>
-      </w:r>
-      <w:r>
-        <w:rPr>
-          <w:color w:val="000000"/>
-        </w:rPr>
-        <w:t xml:space="preserve"> accesos durante el semestre.</w:t>
+        <w:t>{{DOCENTE_2}}</w:t>
       </w:r>
     </w:p>
     <w:p>
@@ -2892,66 +2131,7 @@
         <w:jc w:val="both"/>
       </w:pPr>
       <w:r>
-        <w:rPr>
-          <w:color w:val="000000"/>
-        </w:rPr>
-        <w:t>Henry Alfonso Guío Ávila</w:t>
-      </w:r>
-      <w:r>
-        <w:rPr>
-          <w:color w:val="000000"/>
-        </w:rPr>
-        <w:t xml:space="preserve"> </w:t>
-      </w:r>
-      <w:r>
-        <w:rPr>
-          <w:color w:val="000000"/>
-        </w:rPr>
-        <w:t xml:space="preserve">en </w:t>
-      </w:r>
-      <w:r>
-        <w:rPr>
-          <w:color w:val="000000"/>
-        </w:rPr>
-        <w:t xml:space="preserve">la asignatura </w:t>
-      </w:r>
-      <w:r>
-        <w:rPr>
-          <w:b/>
-          <w:bCs/>
-        </w:rPr>
-        <w:t>AUDITORIA DE SISTEMAS_9A</w:t>
-      </w:r>
-      <w:r>
-        <w:rPr>
-          <w:b/>
-          <w:color w:val="000000"/>
-        </w:rPr>
-        <w:t xml:space="preserve"> </w:t>
-      </w:r>
-      <w:r>
-        <w:rPr>
-          <w:color w:val="000000"/>
-        </w:rPr>
-        <w:t xml:space="preserve">con </w:t>
-      </w:r>
-      <w:r>
-        <w:rPr>
-          <w:color w:val="000000"/>
-        </w:rPr>
-        <w:t>5</w:t>
-      </w:r>
-      <w:r>
-        <w:rPr>
-          <w:color w:val="000000"/>
-        </w:rPr>
-        <w:t>6</w:t>
-      </w:r>
-      <w:r>
-        <w:rPr>
-          <w:color w:val="000000"/>
-        </w:rPr>
-        <w:t xml:space="preserve"> accesos durante el semestre.</w:t>
+        <w:t>{{DOCENTE_3}}</w:t>
       </w:r>
     </w:p>
     <w:p>
@@ -2964,14 +2144,33 @@
           <w:noProof/>
         </w:rPr>
         <w:drawing>
-          <wp:inline distT="0" distB="0" distL="0" distR="0" wp14:anchorId="1206ECB1" wp14:editId="438D927E">
+          <wp:inline xmlns:a="http://schemas.openxmlformats.org/drawingml/2006/main" xmlns:pic="http://schemas.openxmlformats.org/drawingml/2006/picture">
             <wp:extent cx="6400800" cy="4175125"/>
-            <wp:effectExtent l="0" t="0" r="0" b="15875"/>
-            <wp:docPr id="1" name="Gráfico 1"/>
-            <wp:cNvGraphicFramePr/>
-            <a:graphic xmlns:a="http://schemas.openxmlformats.org/drawingml/2006/main">
-              <a:graphicData uri="http://schemas.openxmlformats.org/drawingml/2006/chart">
-                <c:chart xmlns:c="http://schemas.openxmlformats.org/drawingml/2006/chart" xmlns:r="http://schemas.openxmlformats.org/officeDocument/2006/relationships" r:id="rId9"/>
+            <wp:docPr id="226" name="Picture 226"/>
+            <wp:cNvGraphicFramePr>
+              <a:graphicFrameLocks noChangeAspect="1"/>
+            </wp:cNvGraphicFramePr>
+            <a:graphic>
+              <a:graphicData uri="http://schemas.openxmlformats.org/drawingml/2006/picture">
+                <pic:pic>
+                  <pic:nvPicPr>
+                    <pic:cNvPr id="0" name="grafica_2.png"/>
+                    <pic:cNvPicPr/>
+                  </pic:nvPicPr>
+                  <pic:blipFill>
+                    <a:blip r:embed="rId20"/>
+                    <a:stretch>
+                      <a:fillRect/>
+                    </a:stretch>
+                  </pic:blipFill>
+                  <pic:spPr>
+                    <a:xfrm>
+                      <a:off x="0" y="0"/>
+                      <a:ext cx="6400800" cy="4175125"/>
+                    </a:xfrm>
+                    <a:prstGeom prst="rect"/>
+                  </pic:spPr>
+                </pic:pic>
               </a:graphicData>
             </a:graphic>
           </wp:inline>
@@ -2997,7 +2196,7 @@
         </w:rPr>
       </w:pPr>
       <w:r>
-        <w:t>Ilustración 2 Días al mes de uso de la plataforma Open LMS - Docentes 2026-1</w:t>
+        <w:t>Ilustración 2. {{TITULO_GRAFICA_2}}</w:t>
       </w:r>
     </w:p>
     <w:p>
@@ -3072,12 +2271,7 @@
             <w:tcW w:type="dxa" w:w="3360"/>
           </w:tcPr>
           <w:p>
-            <w:r>
-              <w:rPr>
-                <w:sz w:val="16"/>
-              </w:rPr>
-              <w:t>Optimización 6A–6B</w:t>
-            </w:r>
+            <w:r/>
           </w:p>
         </w:tc>
         <w:tc>
@@ -3085,12 +2279,7 @@
             <w:tcW w:type="dxa" w:w="3360"/>
           </w:tcPr>
           <w:p>
-            <w:r>
-              <w:rPr>
-                <w:sz w:val="16"/>
-              </w:rPr>
-              <w:t>Andrea Cruz Yomayusa</w:t>
-            </w:r>
+            <w:r/>
           </w:p>
         </w:tc>
         <w:tc>
@@ -3098,12 +2287,7 @@
             <w:tcW w:type="dxa" w:w="3360"/>
           </w:tcPr>
           <w:p>
-            <w:r>
-              <w:rPr>
-                <w:sz w:val="16"/>
-              </w:rPr>
-              <w:t>67</w:t>
-            </w:r>
+            <w:r/>
           </w:p>
         </w:tc>
       </w:tr>
@@ -3114,12 +2298,7 @@
             <w:shd w:fill="EAF2F8"/>
           </w:tcPr>
           <w:p>
-            <w:r>
-              <w:rPr>
-                <w:sz w:val="16"/>
-              </w:rPr>
-              <w:t>Introducción a la Ingeniería de Sistemas 1A</w:t>
-            </w:r>
+            <w:r/>
           </w:p>
         </w:tc>
         <w:tc>
@@ -3128,12 +2307,7 @@
             <w:shd w:fill="EAF2F8"/>
           </w:tcPr>
           <w:p>
-            <w:r>
-              <w:rPr>
-                <w:sz w:val="16"/>
-              </w:rPr>
-              <w:t>Andrea Cruz Yomayusa</w:t>
-            </w:r>
+            <w:r/>
           </w:p>
         </w:tc>
         <w:tc>
@@ -3142,12 +2316,7 @@
             <w:shd w:fill="EAF2F8"/>
           </w:tcPr>
           <w:p>
-            <w:r>
-              <w:rPr>
-                <w:sz w:val="16"/>
-              </w:rPr>
-              <w:t>59</w:t>
-            </w:r>
+            <w:r/>
           </w:p>
         </w:tc>
       </w:tr>
@@ -3157,12 +2326,7 @@
             <w:tcW w:type="dxa" w:w="3360"/>
           </w:tcPr>
           <w:p>
-            <w:r>
-              <w:rPr>
-                <w:sz w:val="16"/>
-              </w:rPr>
-              <w:t>Auditoría de Sistemas 9A</w:t>
-            </w:r>
+            <w:r/>
           </w:p>
         </w:tc>
         <w:tc>
@@ -3170,12 +2334,7 @@
             <w:tcW w:type="dxa" w:w="3360"/>
           </w:tcPr>
           <w:p>
-            <w:r>
-              <w:rPr>
-                <w:sz w:val="16"/>
-              </w:rPr>
-              <w:t>Henry Alfonso Guío Ávila</w:t>
-            </w:r>
+            <w:r/>
           </w:p>
         </w:tc>
         <w:tc>
@@ -3183,12 +2342,7 @@
             <w:tcW w:type="dxa" w:w="3360"/>
           </w:tcPr>
           <w:p>
-            <w:r>
-              <w:rPr>
-                <w:sz w:val="16"/>
-              </w:rPr>
-              <w:t>56</w:t>
-            </w:r>
+            <w:r/>
           </w:p>
         </w:tc>
       </w:tr>
@@ -3199,12 +2353,7 @@
             <w:shd w:fill="EAF2F8"/>
           </w:tcPr>
           <w:p>
-            <w:r>
-              <w:rPr>
-                <w:sz w:val="16"/>
-              </w:rPr>
-              <w:t>Estructuras de Datos 3D</w:t>
-            </w:r>
+            <w:r/>
           </w:p>
         </w:tc>
         <w:tc>
@@ -3213,12 +2362,7 @@
             <w:shd w:fill="EAF2F8"/>
           </w:tcPr>
           <w:p>
-            <w:r>
-              <w:rPr>
-                <w:sz w:val="16"/>
-              </w:rPr>
-              <w:t>Diego Alejandro Vela Beltrán</w:t>
-            </w:r>
+            <w:r/>
           </w:p>
         </w:tc>
         <w:tc>
@@ -3227,12 +2371,7 @@
             <w:shd w:fill="EAF2F8"/>
           </w:tcPr>
           <w:p>
-            <w:r>
-              <w:rPr>
-                <w:sz w:val="16"/>
-              </w:rPr>
-              <w:t>56</w:t>
-            </w:r>
+            <w:r/>
           </w:p>
         </w:tc>
       </w:tr>
@@ -3242,12 +2381,7 @@
             <w:tcW w:type="dxa" w:w="3360"/>
           </w:tcPr>
           <w:p>
-            <w:r>
-              <w:rPr>
-                <w:sz w:val="16"/>
-              </w:rPr>
-              <w:t>Desarrollo Empresarial 5C</w:t>
-            </w:r>
+            <w:r/>
           </w:p>
         </w:tc>
         <w:tc>
@@ -3255,12 +2389,7 @@
             <w:tcW w:type="dxa" w:w="3360"/>
           </w:tcPr>
           <w:p>
-            <w:r>
-              <w:rPr>
-                <w:sz w:val="16"/>
-              </w:rPr>
-              <w:t>Harrizon Alexander Soler Galindo</w:t>
-            </w:r>
+            <w:r/>
           </w:p>
         </w:tc>
         <w:tc>
@@ -3268,12 +2397,7 @@
             <w:tcW w:type="dxa" w:w="3360"/>
           </w:tcPr>
           <w:p>
-            <w:r>
-              <w:rPr>
-                <w:sz w:val="16"/>
-              </w:rPr>
-              <w:t>55</w:t>
-            </w:r>
+            <w:r/>
           </w:p>
         </w:tc>
       </w:tr>
@@ -3284,12 +2408,7 @@
             <w:shd w:fill="EAF2F8"/>
           </w:tcPr>
           <w:p>
-            <w:r>
-              <w:rPr>
-                <w:sz w:val="16"/>
-              </w:rPr>
-              <w:t>Gerencia de Software 6B</w:t>
-            </w:r>
+            <w:r/>
           </w:p>
         </w:tc>
         <w:tc>
@@ -3298,12 +2417,7 @@
             <w:shd w:fill="EAF2F8"/>
           </w:tcPr>
           <w:p>
-            <w:r>
-              <w:rPr>
-                <w:sz w:val="16"/>
-              </w:rPr>
-              <w:t>Jhon Alexis Piracoca Arcos</w:t>
-            </w:r>
+            <w:r/>
           </w:p>
         </w:tc>
         <w:tc>
@@ -3312,12 +2426,7 @@
             <w:shd w:fill="EAF2F8"/>
           </w:tcPr>
           <w:p>
-            <w:r>
-              <w:rPr>
-                <w:sz w:val="16"/>
-              </w:rPr>
-              <w:t>55</w:t>
-            </w:r>
+            <w:r/>
           </w:p>
         </w:tc>
       </w:tr>
@@ -3342,52 +2451,7 @@
         <w:jc w:val="both"/>
       </w:pPr>
       <w:r>
-        <w:t xml:space="preserve">Con un acceso en promedio de </w:t>
-      </w:r>
-      <w:r>
-        <w:t>18</w:t>
-      </w:r>
-      <w:r>
-        <w:t xml:space="preserve"> estudiantes accediendo durante </w:t>
-      </w:r>
-      <w:r>
-        <w:t>1</w:t>
-      </w:r>
-      <w:r>
-        <w:t>4</w:t>
-      </w:r>
-      <w:r>
-        <w:t xml:space="preserve"> </w:t>
-      </w:r>
-      <w:r>
-        <w:t xml:space="preserve">días al mes, los estudiantes </w:t>
-      </w:r>
-      <w:r>
-        <w:t>d</w:t>
-      </w:r>
-      <w:r>
-        <w:t xml:space="preserve">e la </w:t>
-      </w:r>
-      <w:r>
-        <w:t>F</w:t>
-      </w:r>
-      <w:r>
-        <w:t xml:space="preserve">acultad </w:t>
-      </w:r>
-      <w:r>
-        <w:t>Ingeniería de Sistemas</w:t>
-      </w:r>
-      <w:r>
-        <w:t xml:space="preserve"> </w:t>
-      </w:r>
-      <w:r>
-        <w:t xml:space="preserve">presentan un uso de plataforma </w:t>
-      </w:r>
-      <w:r>
-        <w:t>alto</w:t>
-      </w:r>
-      <w:r>
-        <w:t>.</w:t>
+        <w:t>{{ANALISIS_ESTUDIANTES}}</w:t>
       </w:r>
     </w:p>
     <w:p>
@@ -3415,60 +2479,7 @@
         <w:jc w:val="both"/>
       </w:pPr>
       <w:r>
-        <w:rPr>
-          <w:b/>
-          <w:color w:val="000000"/>
-        </w:rPr>
-        <w:t>CIBERSEGURIDAD: WHITE HAT &amp; BLUE TEAM STRATEGIES_9B</w:t>
-      </w:r>
-      <w:r>
-        <w:rPr>
-          <w:b/>
-          <w:color w:val="000000"/>
-        </w:rPr>
-        <w:t xml:space="preserve"> </w:t>
-      </w:r>
-      <w:r>
-        <w:rPr>
-          <w:color w:val="000000"/>
-        </w:rPr>
-        <w:t xml:space="preserve">con </w:t>
-      </w:r>
-      <w:r>
-        <w:rPr>
-          <w:color w:val="000000"/>
-        </w:rPr>
-        <w:t>1</w:t>
-      </w:r>
-      <w:r>
-        <w:rPr>
-          <w:color w:val="000000"/>
-        </w:rPr>
-        <w:t>06</w:t>
-      </w:r>
-      <w:r>
-        <w:rPr>
-          <w:color w:val="000000"/>
-        </w:rPr>
-        <w:t xml:space="preserve"> accesos durante el semestre por parte de </w:t>
-      </w:r>
-      <w:r>
-        <w:rPr>
-          <w:color w:val="000000"/>
-        </w:rPr>
-        <w:t>146</w:t>
-      </w:r>
-      <w:r>
-        <w:rPr>
-          <w:color w:val="000000"/>
-        </w:rPr>
-        <w:t xml:space="preserve"> </w:t>
-      </w:r>
-      <w:r>
-        <w:rPr>
-          <w:color w:val="000000"/>
-        </w:rPr>
-        <w:t>estudiantes.</w:t>
+        <w:t>{{CURSO_1}}</w:t>
       </w:r>
     </w:p>
     <w:p>
@@ -3488,48 +2499,7 @@
         <w:jc w:val="both"/>
       </w:pPr>
       <w:r>
-        <w:rPr>
-          <w:b/>
-          <w:color w:val="000000"/>
-        </w:rPr>
-        <w:t>REQUERIMIENTOS Y DISEÑO DE SOFTWARE_3E</w:t>
-      </w:r>
-      <w:r>
-        <w:rPr>
-          <w:b/>
-          <w:color w:val="000000"/>
-        </w:rPr>
-        <w:t xml:space="preserve"> </w:t>
-      </w:r>
-      <w:r>
-        <w:rPr>
-          <w:color w:val="000000"/>
-        </w:rPr>
-        <w:t xml:space="preserve">con </w:t>
-      </w:r>
-      <w:r>
-        <w:rPr>
-          <w:color w:val="000000"/>
-        </w:rPr>
-        <w:t>106</w:t>
-      </w:r>
-      <w:r>
-        <w:rPr>
-          <w:color w:val="000000"/>
-        </w:rPr>
-        <w:t xml:space="preserve"> accesos durante el semestre por parte de </w:t>
-      </w:r>
-      <w:r>
-        <w:rPr>
-          <w:color w:val="000000"/>
-        </w:rPr>
-        <w:t>125</w:t>
-      </w:r>
-      <w:r>
-        <w:rPr>
-          <w:color w:val="000000"/>
-        </w:rPr>
-        <w:t xml:space="preserve"> estudiantes.</w:t>
+        <w:t>{{CURSO_2}}</w:t>
       </w:r>
     </w:p>
     <w:p>
@@ -3549,54 +2519,7 @@
         <w:jc w:val="both"/>
       </w:pPr>
       <w:r>
-        <w:rPr>
-          <w:b/>
-          <w:color w:val="000000"/>
-        </w:rPr>
-        <w:t>DESARROLLO EMPRESARIAL_5C</w:t>
-      </w:r>
-      <w:r>
-        <w:rPr>
-          <w:b/>
-          <w:color w:val="000000"/>
-        </w:rPr>
-        <w:t xml:space="preserve"> </w:t>
-      </w:r>
-      <w:r>
-        <w:rPr>
-          <w:color w:val="000000"/>
-        </w:rPr>
-        <w:t xml:space="preserve">con </w:t>
-      </w:r>
-      <w:r>
-        <w:rPr>
-          <w:color w:val="000000"/>
-        </w:rPr>
-        <w:t>1</w:t>
-      </w:r>
-      <w:r>
-        <w:rPr>
-          <w:color w:val="000000"/>
-        </w:rPr>
-        <w:t>05</w:t>
-      </w:r>
-      <w:r>
-        <w:rPr>
-          <w:color w:val="000000"/>
-        </w:rPr>
-        <w:t xml:space="preserve"> accesos durante el semestre por parte de </w:t>
-      </w:r>
-      <w:r>
-        <w:rPr>
-          <w:color w:val="000000"/>
-        </w:rPr>
-        <w:t>128</w:t>
-      </w:r>
-      <w:r>
-        <w:rPr>
-          <w:color w:val="000000"/>
-        </w:rPr>
-        <w:t xml:space="preserve"> estudiantes.</w:t>
+        <w:t>{{CURSO_3}}</w:t>
       </w:r>
     </w:p>
     <w:p>
@@ -3621,14 +2544,33 @@
           <w:noProof/>
         </w:rPr>
         <w:drawing>
-          <wp:inline distT="0" distB="0" distL="0" distR="0" wp14:anchorId="6711880B" wp14:editId="2C86A2F7">
+          <wp:inline xmlns:a="http://schemas.openxmlformats.org/drawingml/2006/main" xmlns:pic="http://schemas.openxmlformats.org/drawingml/2006/picture">
             <wp:extent cx="6400800" cy="4246245"/>
-            <wp:effectExtent l="0" t="0" r="0" b="1905"/>
-            <wp:docPr id="4" name="Gráfico 4"/>
-            <wp:cNvGraphicFramePr/>
-            <a:graphic xmlns:a="http://schemas.openxmlformats.org/drawingml/2006/main">
-              <a:graphicData uri="http://schemas.openxmlformats.org/drawingml/2006/chart">
-                <c:chart xmlns:c="http://schemas.openxmlformats.org/drawingml/2006/chart" xmlns:r="http://schemas.openxmlformats.org/officeDocument/2006/relationships" r:id="rId10"/>
+            <wp:docPr id="227" name="Picture 227"/>
+            <wp:cNvGraphicFramePr>
+              <a:graphicFrameLocks noChangeAspect="1"/>
+            </wp:cNvGraphicFramePr>
+            <a:graphic>
+              <a:graphicData uri="http://schemas.openxmlformats.org/drawingml/2006/picture">
+                <pic:pic>
+                  <pic:nvPicPr>
+                    <pic:cNvPr id="0" name="grafica_3.png"/>
+                    <pic:cNvPicPr/>
+                  </pic:nvPicPr>
+                  <pic:blipFill>
+                    <a:blip r:embed="rId21"/>
+                    <a:stretch>
+                      <a:fillRect/>
+                    </a:stretch>
+                  </pic:blipFill>
+                  <pic:spPr>
+                    <a:xfrm>
+                      <a:off x="0" y="0"/>
+                      <a:ext cx="6400800" cy="4246245"/>
+                    </a:xfrm>
+                    <a:prstGeom prst="rect"/>
+                  </pic:spPr>
+                </pic:pic>
               </a:graphicData>
             </a:graphic>
           </wp:inline>
@@ -3654,7 +2596,7 @@
         </w:rPr>
       </w:pPr>
       <w:r>
-        <w:t>Ilustración 3 Días al mes de uso de la plataforma Open LMS - Estudiantes 2026-1</w:t>
+        <w:t>Ilustración 3. {{TITULO_GRAFICA_3}}</w:t>
       </w:r>
     </w:p>
     <w:p>
@@ -3685,14 +2627,33 @@
           <w:noProof/>
         </w:rPr>
         <w:drawing>
-          <wp:inline distT="0" distB="0" distL="0" distR="0" wp14:anchorId="16D5F203" wp14:editId="65C8C322">
+          <wp:inline xmlns:a="http://schemas.openxmlformats.org/drawingml/2006/main" xmlns:pic="http://schemas.openxmlformats.org/drawingml/2006/picture">
             <wp:extent cx="6366510" cy="3878580"/>
-            <wp:effectExtent l="0" t="0" r="15240" b="7620"/>
-            <wp:docPr id="9" name="Gráfico 9"/>
-            <wp:cNvGraphicFramePr/>
-            <a:graphic xmlns:a="http://schemas.openxmlformats.org/drawingml/2006/main">
-              <a:graphicData uri="http://schemas.openxmlformats.org/drawingml/2006/chart">
-                <c:chart xmlns:c="http://schemas.openxmlformats.org/drawingml/2006/chart" xmlns:r="http://schemas.openxmlformats.org/officeDocument/2006/relationships" r:id="rId11"/>
+            <wp:docPr id="228" name="Picture 228"/>
+            <wp:cNvGraphicFramePr>
+              <a:graphicFrameLocks noChangeAspect="1"/>
+            </wp:cNvGraphicFramePr>
+            <a:graphic>
+              <a:graphicData uri="http://schemas.openxmlformats.org/drawingml/2006/picture">
+                <pic:pic>
+                  <pic:nvPicPr>
+                    <pic:cNvPr id="0" name="grafica_4.png"/>
+                    <pic:cNvPicPr/>
+                  </pic:nvPicPr>
+                  <pic:blipFill>
+                    <a:blip r:embed="rId22"/>
+                    <a:stretch>
+                      <a:fillRect/>
+                    </a:stretch>
+                  </pic:blipFill>
+                  <pic:spPr>
+                    <a:xfrm>
+                      <a:off x="0" y="0"/>
+                      <a:ext cx="6366510" cy="3878580"/>
+                    </a:xfrm>
+                    <a:prstGeom prst="rect"/>
+                  </pic:spPr>
+                </pic:pic>
               </a:graphicData>
             </a:graphic>
           </wp:inline>
@@ -3718,7 +2679,7 @@
         </w:rPr>
       </w:pPr>
       <w:r>
-        <w:t>Ilustración 4 Promedio de uso de la plataforma Open LMS - Estudiantes 2026-1</w:t>
+        <w:t>Ilustración 4. {{TITULO_GRAFICA_4}}</w:t>
       </w:r>
     </w:p>
     <w:p>
@@ -3743,7 +2704,7 @@
         <w:drawing>
           <wp:inline xmlns:a="http://schemas.openxmlformats.org/drawingml/2006/main" xmlns:pic="http://schemas.openxmlformats.org/drawingml/2006/picture">
             <wp:extent cx="6080760" cy="3378200"/>
-            <wp:docPr id="224" name="Picture 224"/>
+            <wp:docPr id="229" name="Picture 229"/>
             <wp:cNvGraphicFramePr>
               <a:graphicFrameLocks noChangeAspect="1"/>
             </wp:cNvGraphicFramePr>
@@ -3751,11 +2712,11 @@
               <a:graphicData uri="http://schemas.openxmlformats.org/drawingml/2006/picture">
                 <pic:pic>
                   <pic:nvPicPr>
-                    <pic:cNvPr id="0" name="cursos_destacados.png"/>
+                    <pic:cNvPr id="0" name="grafica_5.png"/>
                     <pic:cNvPicPr/>
                   </pic:nvPicPr>
                   <pic:blipFill>
-                    <a:blip r:embed="rId18"/>
+                    <a:blip r:embed="rId23"/>
                     <a:stretch>
                       <a:fillRect/>
                     </a:stretch>
@@ -3779,12 +2740,7 @@
         <w:jc w:val="center"/>
       </w:pPr>
       <w:r>
-        <w:rPr>
-          <w:i/>
-          <w:color w:val="5B6573"/>
-          <w:sz w:val="17"/>
-        </w:rPr>
-        <w:t>Ilustración 5. Cursos con mayor número de eventos estudiantiles. Fuente: registros originales de Open LMS.</w:t>
+        <w:t>Ilustración 5. {{TITULO_GRAFICA_5}}</w:t>
       </w:r>
     </w:p>
     <w:tbl>
@@ -3871,12 +2827,7 @@
             <w:tcW w:type="dxa" w:w="2520"/>
           </w:tcPr>
           <w:p>
-            <w:r>
-              <w:rPr>
-                <w:sz w:val="16"/>
-              </w:rPr>
-              <w:t>Optimización 6A–6B</w:t>
-            </w:r>
+            <w:r/>
           </w:p>
         </w:tc>
         <w:tc>
@@ -3884,12 +2835,7 @@
             <w:tcW w:type="dxa" w:w="2520"/>
           </w:tcPr>
           <w:p>
-            <w:r>
-              <w:rPr>
-                <w:sz w:val="16"/>
-              </w:rPr>
-              <w:t>22.789</w:t>
-            </w:r>
+            <w:r/>
           </w:p>
         </w:tc>
         <w:tc>
@@ -3897,12 +2843,7 @@
             <w:tcW w:type="dxa" w:w="2520"/>
           </w:tcPr>
           <w:p>
-            <w:r>
-              <w:rPr>
-                <w:sz w:val="16"/>
-              </w:rPr>
-              <w:t>52</w:t>
-            </w:r>
+            <w:r/>
           </w:p>
         </w:tc>
         <w:tc>
@@ -3910,12 +2851,7 @@
             <w:tcW w:type="dxa" w:w="2520"/>
           </w:tcPr>
           <w:p>
-            <w:r>
-              <w:rPr>
-                <w:sz w:val="16"/>
-              </w:rPr>
-              <w:t>100</w:t>
-            </w:r>
+            <w:r/>
           </w:p>
         </w:tc>
       </w:tr>
@@ -3926,12 +2862,7 @@
             <w:shd w:fill="EAF2F8"/>
           </w:tcPr>
           <w:p>
-            <w:r>
-              <w:rPr>
-                <w:sz w:val="16"/>
-              </w:rPr>
-              <w:t>Cloud Computing 8A</w:t>
-            </w:r>
+            <w:r/>
           </w:p>
         </w:tc>
         <w:tc>
@@ -3940,12 +2871,7 @@
             <w:shd w:fill="EAF2F8"/>
           </w:tcPr>
           <w:p>
-            <w:r>
-              <w:rPr>
-                <w:sz w:val="16"/>
-              </w:rPr>
-              <w:t>14.524</w:t>
-            </w:r>
+            <w:r/>
           </w:p>
         </w:tc>
         <w:tc>
@@ -3954,12 +2880,7 @@
             <w:shd w:fill="EAF2F8"/>
           </w:tcPr>
           <w:p>
-            <w:r>
-              <w:rPr>
-                <w:sz w:val="16"/>
-              </w:rPr>
-              <w:t>33</w:t>
-            </w:r>
+            <w:r/>
           </w:p>
         </w:tc>
         <w:tc>
@@ -3968,12 +2889,7 @@
             <w:shd w:fill="EAF2F8"/>
           </w:tcPr>
           <w:p>
-            <w:r>
-              <w:rPr>
-                <w:sz w:val="16"/>
-              </w:rPr>
-              <w:t>102</w:t>
-            </w:r>
+            <w:r/>
           </w:p>
         </w:tc>
       </w:tr>
@@ -3983,12 +2899,7 @@
             <w:tcW w:type="dxa" w:w="2520"/>
           </w:tcPr>
           <w:p>
-            <w:r>
-              <w:rPr>
-                <w:sz w:val="16"/>
-              </w:rPr>
-              <w:t>Bases de Datos 2A</w:t>
-            </w:r>
+            <w:r/>
           </w:p>
         </w:tc>
         <w:tc>
@@ -3996,12 +2907,7 @@
             <w:tcW w:type="dxa" w:w="2520"/>
           </w:tcPr>
           <w:p>
-            <w:r>
-              <w:rPr>
-                <w:sz w:val="16"/>
-              </w:rPr>
-              <w:t>13.014</w:t>
-            </w:r>
+            <w:r/>
           </w:p>
         </w:tc>
         <w:tc>
@@ -4009,12 +2915,7 @@
             <w:tcW w:type="dxa" w:w="2520"/>
           </w:tcPr>
           <w:p>
-            <w:r>
-              <w:rPr>
-                <w:sz w:val="16"/>
-              </w:rPr>
-              <w:t>32</w:t>
-            </w:r>
+            <w:r/>
           </w:p>
         </w:tc>
         <w:tc>
@@ -4022,12 +2923,7 @@
             <w:tcW w:type="dxa" w:w="2520"/>
           </w:tcPr>
           <w:p>
-            <w:r>
-              <w:rPr>
-                <w:sz w:val="16"/>
-              </w:rPr>
-              <w:t>95</w:t>
-            </w:r>
+            <w:r/>
           </w:p>
         </w:tc>
       </w:tr>
@@ -4038,12 +2934,7 @@
             <w:shd w:fill="EAF2F8"/>
           </w:tcPr>
           <w:p>
-            <w:r>
-              <w:rPr>
-                <w:sz w:val="16"/>
-              </w:rPr>
-              <w:t>Introducción a Ingeniería de Sistemas 1A</w:t>
-            </w:r>
+            <w:r/>
           </w:p>
         </w:tc>
         <w:tc>
@@ -4052,12 +2943,7 @@
             <w:shd w:fill="EAF2F8"/>
           </w:tcPr>
           <w:p>
-            <w:r>
-              <w:rPr>
-                <w:sz w:val="16"/>
-              </w:rPr>
-              <w:t>12.418</w:t>
-            </w:r>
+            <w:r/>
           </w:p>
         </w:tc>
         <w:tc>
@@ -4066,12 +2952,7 @@
             <w:shd w:fill="EAF2F8"/>
           </w:tcPr>
           <w:p>
-            <w:r>
-              <w:rPr>
-                <w:sz w:val="16"/>
-              </w:rPr>
-              <w:t>23</w:t>
-            </w:r>
+            <w:r/>
           </w:p>
         </w:tc>
         <w:tc>
@@ -4080,12 +2961,7 @@
             <w:shd w:fill="EAF2F8"/>
           </w:tcPr>
           <w:p>
-            <w:r>
-              <w:rPr>
-                <w:sz w:val="16"/>
-              </w:rPr>
-              <w:t>94</w:t>
-            </w:r>
+            <w:r/>
           </w:p>
         </w:tc>
       </w:tr>
@@ -4095,12 +2971,7 @@
             <w:tcW w:type="dxa" w:w="2520"/>
           </w:tcPr>
           <w:p>
-            <w:r>
-              <w:rPr>
-                <w:sz w:val="16"/>
-              </w:rPr>
-              <w:t>Redes 6A–6B</w:t>
-            </w:r>
+            <w:r/>
           </w:p>
         </w:tc>
         <w:tc>
@@ -4108,12 +2979,7 @@
             <w:tcW w:type="dxa" w:w="2520"/>
           </w:tcPr>
           <w:p>
-            <w:r>
-              <w:rPr>
-                <w:sz w:val="16"/>
-              </w:rPr>
-              <w:t>11.990</w:t>
-            </w:r>
+            <w:r/>
           </w:p>
         </w:tc>
         <w:tc>
@@ -4121,12 +2987,7 @@
             <w:tcW w:type="dxa" w:w="2520"/>
           </w:tcPr>
           <w:p>
-            <w:r>
-              <w:rPr>
-                <w:sz w:val="16"/>
-              </w:rPr>
-              <w:t>56</w:t>
-            </w:r>
+            <w:r/>
           </w:p>
         </w:tc>
         <w:tc>
@@ -4134,12 +2995,7 @@
             <w:tcW w:type="dxa" w:w="2520"/>
           </w:tcPr>
           <w:p>
-            <w:r>
-              <w:rPr>
-                <w:sz w:val="16"/>
-              </w:rPr>
-              <w:t>96</w:t>
-            </w:r>
+            <w:r/>
           </w:p>
         </w:tc>
       </w:tr>
@@ -4150,12 +3006,7 @@
             <w:shd w:fill="EAF2F8"/>
           </w:tcPr>
           <w:p>
-            <w:r>
-              <w:rPr>
-                <w:sz w:val="16"/>
-              </w:rPr>
-              <w:t>Ciberseguridad 9B</w:t>
-            </w:r>
+            <w:r/>
           </w:p>
         </w:tc>
         <w:tc>
@@ -4164,12 +3015,7 @@
             <w:shd w:fill="EAF2F8"/>
           </w:tcPr>
           <w:p>
-            <w:r>
-              <w:rPr>
-                <w:sz w:val="16"/>
-              </w:rPr>
-              <w:t>11.889</w:t>
-            </w:r>
+            <w:r/>
           </w:p>
         </w:tc>
         <w:tc>
@@ -4178,12 +3024,7 @@
             <w:shd w:fill="EAF2F8"/>
           </w:tcPr>
           <w:p>
-            <w:r>
-              <w:rPr>
-                <w:sz w:val="16"/>
-              </w:rPr>
-              <w:t>34</w:t>
-            </w:r>
+            <w:r/>
           </w:p>
         </w:tc>
         <w:tc>
@@ -4192,12 +3033,7 @@
             <w:shd w:fill="EAF2F8"/>
           </w:tcPr>
           <w:p>
-            <w:r>
-              <w:rPr>
-                <w:sz w:val="16"/>
-              </w:rPr>
-              <w:t>106</w:t>
-            </w:r>
+            <w:r/>
           </w:p>
         </w:tc>
       </w:tr>
@@ -4241,27 +3077,7 @@
         <w:keepNext/>
       </w:pPr>
       <w:r>
-        <w:t xml:space="preserve">La </w:t>
-      </w:r>
-      <w:r>
-        <w:t>Facultad Ingeniería de Si</w:t>
-      </w:r>
-      <w:r>
-        <w:t>stemas cuenta con un total de 59</w:t>
-      </w:r>
-      <w:bookmarkStart w:id="9" w:name="_GoBack"/>
-      <w:bookmarkEnd w:id="9"/>
-      <w:r>
-        <w:t xml:space="preserve"> </w:t>
-      </w:r>
-      <w:r>
-        <w:t>cursos en plataforma, todos ellos con contenido completo</w:t>
-      </w:r>
-      <w:r>
-        <w:t xml:space="preserve"> (100%)</w:t>
-      </w:r>
-      <w:r>
-        <w:t>, lo que refleja un excelente trabajo por parte de los docentes.</w:t>
+        <w:t>{{ANALISIS_DISENO}}</w:t>
       </w:r>
     </w:p>
     <w:p/>
@@ -4275,14 +3091,33 @@
           <w:noProof/>
         </w:rPr>
         <w:drawing>
-          <wp:inline distT="0" distB="0" distL="0" distR="0" wp14:anchorId="69C32582" wp14:editId="7FDD47D2">
+          <wp:inline xmlns:a="http://schemas.openxmlformats.org/drawingml/2006/main" xmlns:pic="http://schemas.openxmlformats.org/drawingml/2006/picture">
             <wp:extent cx="4572000" cy="2743200"/>
-            <wp:effectExtent l="0" t="0" r="0" b="0"/>
-            <wp:docPr id="10" name="Gráfico 10"/>
-            <wp:cNvGraphicFramePr/>
-            <a:graphic xmlns:a="http://schemas.openxmlformats.org/drawingml/2006/main">
-              <a:graphicData uri="http://schemas.openxmlformats.org/drawingml/2006/chart">
-                <c:chart xmlns:c="http://schemas.openxmlformats.org/drawingml/2006/chart" xmlns:r="http://schemas.openxmlformats.org/officeDocument/2006/relationships" r:id="rId12"/>
+            <wp:docPr id="230" name="Picture 230"/>
+            <wp:cNvGraphicFramePr>
+              <a:graphicFrameLocks noChangeAspect="1"/>
+            </wp:cNvGraphicFramePr>
+            <a:graphic>
+              <a:graphicData uri="http://schemas.openxmlformats.org/drawingml/2006/picture">
+                <pic:pic>
+                  <pic:nvPicPr>
+                    <pic:cNvPr id="0" name="grafica_6.png"/>
+                    <pic:cNvPicPr/>
+                  </pic:nvPicPr>
+                  <pic:blipFill>
+                    <a:blip r:embed="rId24"/>
+                    <a:stretch>
+                      <a:fillRect/>
+                    </a:stretch>
+                  </pic:blipFill>
+                  <pic:spPr>
+                    <a:xfrm>
+                      <a:off x="0" y="0"/>
+                      <a:ext cx="4572000" cy="2743200"/>
+                    </a:xfrm>
+                    <a:prstGeom prst="rect"/>
+                  </pic:spPr>
+                </pic:pic>
               </a:graphicData>
             </a:graphic>
           </wp:inline>
@@ -4308,7 +3143,7 @@
         </w:rPr>
       </w:pPr>
       <w:r>
-        <w:t>Ilustración 6 Porcentaje de cursos con contenido</w:t>
+        <w:t>Ilustración 6. {{TITULO_GRAFICA_6}}</w:t>
       </w:r>
     </w:p>
     <w:sectPr>

</xml_diff>

<commit_message>
Mejora interfaz generador Word e iconos Excel
</commit_message>
<xml_diff>
--- a/templates/PLANTILLA_INFORME.docx
+++ b/templates/PLANTILLA_INFORME.docx
@@ -5,7 +5,9 @@
     <w:p/>
     <w:p>
       <w:pPr>
+        <w:keepNext/>
         <w:spacing w:line="259" w:lineRule="auto"/>
+        <w:jc w:val="center"/>
       </w:pPr>
       <w:r>
         <w:rPr>
@@ -922,6 +924,7 @@
     </w:p>
     <w:p>
       <w:pPr>
+        <w:spacing w:after="320"/>
         <w:rPr>
           <w:b/>
         </w:rPr>
@@ -933,229 +936,26 @@
         <w:t>Tabla de ilustraciones</w:t>
       </w:r>
     </w:p>
-    <w:sdt>
-      <w:sdtPr>
-        <w:id w:val="-342006454"/>
-        <w:docPartObj>
-          <w:docPartGallery w:val="Table of Contents"/>
-          <w:docPartUnique/>
-        </w:docPartObj>
-      </w:sdtPr>
-      <w:sdtEndPr/>
-      <w:sdtContent>
-        <w:p>
-          <w:pPr>
-            <w:pBdr>
-              <w:top w:val="nil"/>
-              <w:left w:val="nil"/>
-              <w:bottom w:val="nil"/>
-              <w:right w:val="nil"/>
-              <w:between w:val="nil"/>
-            </w:pBdr>
-            <w:tabs>
-              <w:tab w:val="right" w:pos="8828"/>
-            </w:tabs>
-            <w:spacing w:after="0"/>
-            <w:ind w:left="8828" w:hanging="8828"/>
-            <w:rPr>
-              <w:rFonts w:ascii="Calibri" w:eastAsia="Calibri" w:hAnsi="Calibri" w:cs="Calibri"/>
-              <w:color w:val="000000"/>
-              <w:sz w:val="22"/>
-              <w:szCs w:val="22"/>
-            </w:rPr>
-          </w:pPr>
-          <w:r>
-            <w:fldChar w:fldCharType="begin"/>
-          </w:r>
-          <w:r>
-            <w:instrText xml:space="preserve"> TOC \h \u \z </w:instrText>
-          </w:r>
-          <w:r>
-            <w:fldChar w:fldCharType="separate"/>
-          </w:r>
-          <w:hyperlink w:anchor="_heading=h.3znysh7">
-            <w:r>
-              <w:rPr>
-                <w:color w:val="000000"/>
-              </w:rPr>
-              <w:t xml:space="preserve">Ilustración 1 Días al mes de uso de la plataforma Open LMS - Docentes </w:t>
-            </w:r>
-            <w:r>
-              <w:rPr>
-                <w:color w:val="000000"/>
-              </w:rPr>
-              <w:t>2026</w:t>
-            </w:r>
-            <w:r>
-              <w:rPr>
-                <w:color w:val="000000"/>
-              </w:rPr>
-              <w:t>-</w:t>
-            </w:r>
-            <w:r>
-              <w:rPr>
-                <w:color w:val="000000"/>
-              </w:rPr>
-              <w:t>1</w:t>
-            </w:r>
-            <w:r>
-              <w:rPr>
-                <w:color w:val="000000"/>
-              </w:rPr>
-              <w:tab/>
-              <w:t>7</w:t>
-            </w:r>
-          </w:hyperlink>
-        </w:p>
-        <w:p>
-          <w:pPr>
-            <w:pBdr>
-              <w:top w:val="nil"/>
-              <w:left w:val="nil"/>
-              <w:bottom w:val="nil"/>
-              <w:right w:val="nil"/>
-              <w:between w:val="nil"/>
-            </w:pBdr>
-            <w:tabs>
-              <w:tab w:val="right" w:pos="8828"/>
-            </w:tabs>
-            <w:spacing w:after="0"/>
-            <w:rPr>
-              <w:rFonts w:ascii="Calibri" w:eastAsia="Calibri" w:hAnsi="Calibri" w:cs="Calibri"/>
-              <w:color w:val="000000"/>
-              <w:sz w:val="22"/>
-              <w:szCs w:val="22"/>
-            </w:rPr>
-          </w:pPr>
-          <w:hyperlink w:anchor="_heading=h.tyjcwt">
-            <w:r>
-              <w:rPr>
-                <w:color w:val="000000"/>
-              </w:rPr>
-              <w:t xml:space="preserve">Ilustración 2 Días al mes de uso de la plataforma Open LMS - Estudiantes </w:t>
-            </w:r>
-            <w:r>
-              <w:rPr>
-                <w:color w:val="000000"/>
-              </w:rPr>
-              <w:t>2026</w:t>
-            </w:r>
-            <w:r>
-              <w:rPr>
-                <w:color w:val="000000"/>
-              </w:rPr>
-              <w:t>-</w:t>
-            </w:r>
-            <w:r>
-              <w:rPr>
-                <w:color w:val="000000"/>
-              </w:rPr>
-              <w:t>1</w:t>
-            </w:r>
-            <w:r>
-              <w:rPr>
-                <w:color w:val="000000"/>
-              </w:rPr>
-              <w:tab/>
-              <w:t>8</w:t>
-            </w:r>
-          </w:hyperlink>
-        </w:p>
-        <w:p>
-          <w:pPr>
-            <w:pBdr>
-              <w:top w:val="nil"/>
-              <w:left w:val="nil"/>
-              <w:bottom w:val="nil"/>
-              <w:right w:val="nil"/>
-              <w:between w:val="nil"/>
-            </w:pBdr>
-            <w:tabs>
-              <w:tab w:val="right" w:pos="8828"/>
-            </w:tabs>
-            <w:spacing w:after="0"/>
-            <w:rPr>
-              <w:rFonts w:ascii="Calibri" w:eastAsia="Calibri" w:hAnsi="Calibri" w:cs="Calibri"/>
-              <w:color w:val="000000"/>
-              <w:sz w:val="22"/>
-              <w:szCs w:val="22"/>
-            </w:rPr>
-          </w:pPr>
-          <w:hyperlink w:anchor="_heading=h.3dy6vkm">
-            <w:r>
-              <w:rPr>
-                <w:color w:val="000000"/>
-              </w:rPr>
-              <w:t xml:space="preserve">Ilustración 3 Promedio de uso de la plataforma Open LMS - Estudiantes </w:t>
-            </w:r>
-            <w:r>
-              <w:rPr>
-                <w:color w:val="000000"/>
-              </w:rPr>
-              <w:t>2026</w:t>
-            </w:r>
-            <w:r>
-              <w:rPr>
-                <w:color w:val="000000"/>
-              </w:rPr>
-              <w:t>-</w:t>
-            </w:r>
-            <w:r>
-              <w:rPr>
-                <w:color w:val="000000"/>
-              </w:rPr>
-              <w:t>1</w:t>
-            </w:r>
-            <w:r>
-              <w:rPr>
-                <w:color w:val="000000"/>
-              </w:rPr>
-              <w:tab/>
-              <w:t>9</w:t>
-            </w:r>
-          </w:hyperlink>
-        </w:p>
-        <w:p>
-          <w:pPr>
-            <w:pBdr>
-              <w:top w:val="nil"/>
-              <w:left w:val="nil"/>
-              <w:bottom w:val="nil"/>
-              <w:right w:val="nil"/>
-              <w:between w:val="nil"/>
-            </w:pBdr>
-            <w:tabs>
-              <w:tab w:val="right" w:pos="8828"/>
-            </w:tabs>
-            <w:spacing w:after="0"/>
-            <w:rPr>
-              <w:rFonts w:ascii="Calibri" w:eastAsia="Calibri" w:hAnsi="Calibri" w:cs="Calibri"/>
-              <w:color w:val="000000"/>
-              <w:sz w:val="22"/>
-              <w:szCs w:val="22"/>
-            </w:rPr>
-          </w:pPr>
-          <w:hyperlink w:anchor="_heading=h.4d34og8">
-            <w:r>
-              <w:rPr>
-                <w:color w:val="000000"/>
-              </w:rPr>
-              <w:t>Ilustración 4 Porcentaje de cursos con contenido</w:t>
-            </w:r>
-            <w:r>
-              <w:rPr>
-                <w:color w:val="000000"/>
-              </w:rPr>
-              <w:tab/>
-              <w:t>10</w:t>
-            </w:r>
-          </w:hyperlink>
-          <w:r>
-            <w:fldChar w:fldCharType="end"/>
-          </w:r>
-        </w:p>
-      </w:sdtContent>
-    </w:sdt>
+    <w:p>
+      <w:pPr>
+        <w:pStyle w:val="TableofFigures"/>
+      </w:pPr>
+      <w:r>
+        <w:fldChar w:fldCharType="begin" w:dirty="true"/>
+      </w:r>
+      <w:r>
+        <w:instrText xml:space="preserve"> TOC \h \z \c "FiguraInforme" </w:instrText>
+      </w:r>
+      <w:r>
+        <w:fldChar w:fldCharType="separate"/>
+      </w:r>
+      <w:r>
+        <w:t>La tabla de ilustraciones se actualizará al abrir el documento.</w:t>
+      </w:r>
+      <w:r>
+        <w:fldChar w:fldCharType="end"/>
+      </w:r>
+    </w:p>
     <w:p>
       <w:pPr>
         <w:spacing w:line="259" w:lineRule="auto"/>
@@ -1206,6 +1006,9 @@
         <w:gridCol w:w="3360"/>
       </w:tblGrid>
       <w:tr>
+        <w:trPr>
+          <w:cantSplit/>
+        </w:trPr>
         <w:tc>
           <w:tcPr>
             <w:tcW w:type="dxa" w:w="3360"/>
@@ -1256,6 +1059,9 @@
         </w:tc>
       </w:tr>
       <w:tr>
+        <w:trPr>
+          <w:cantSplit/>
+        </w:trPr>
         <w:tc>
           <w:tcPr>
             <w:tcW w:type="dxa" w:w="3360"/>
@@ -1282,6 +1088,9 @@
         </w:tc>
       </w:tr>
       <w:tr>
+        <w:trPr>
+          <w:cantSplit/>
+        </w:trPr>
         <w:tc>
           <w:tcPr>
             <w:tcW w:type="dxa" w:w="3360"/>
@@ -1311,6 +1120,9 @@
         </w:tc>
       </w:tr>
       <w:tr>
+        <w:trPr>
+          <w:cantSplit/>
+        </w:trPr>
         <w:tc>
           <w:tcPr>
             <w:tcW w:type="dxa" w:w="3360"/>
@@ -1337,6 +1149,9 @@
         </w:tc>
       </w:tr>
       <w:tr>
+        <w:trPr>
+          <w:cantSplit/>
+        </w:trPr>
         <w:tc>
           <w:tcPr>
             <w:tcW w:type="dxa" w:w="3360"/>
@@ -1366,6 +1181,9 @@
         </w:tc>
       </w:tr>
       <w:tr>
+        <w:trPr>
+          <w:cantSplit/>
+        </w:trPr>
         <w:tc>
           <w:tcPr>
             <w:tcW w:type="dxa" w:w="3360"/>
@@ -1392,6 +1210,9 @@
         </w:tc>
       </w:tr>
       <w:tr>
+        <w:trPr>
+          <w:cantSplit/>
+        </w:trPr>
         <w:tc>
           <w:tcPr>
             <w:tcW w:type="dxa" w:w="3360"/>
@@ -1428,25 +1249,13 @@
     </w:p>
     <w:p>
       <w:pPr>
-        <w:spacing w:line="259" w:lineRule="auto"/>
-        <w:rPr>
-          <w:b/>
-        </w:rPr>
+        <w:pStyle w:val="Ttulo1"/>
+        <w:keepNext/>
+        <w:pageBreakBefore/>
       </w:pPr>
       <w:r>
-        <w:br w:type="page"/>
+        <w:t>1. Introducción</w:t>
       </w:r>
-    </w:p>
-    <w:p>
-      <w:pPr>
-        <w:pStyle w:val="Ttulo1"/>
-      </w:pPr>
-      <w:bookmarkStart w:id="1" w:name="_Toc109393328"/>
-      <w:r>
-        <w:lastRenderedPageBreak/>
-        <w:t>Introducción</w:t>
-      </w:r>
-      <w:bookmarkEnd w:id="1"/>
     </w:p>
     <w:p>
       <w:pPr>
@@ -1475,9 +1284,11 @@
     <w:p>
       <w:pPr>
         <w:pStyle w:val="Ttulo1"/>
+        <w:keepNext/>
+        <w:pageBreakBefore/>
       </w:pPr>
       <w:r>
-        <w:t>Metodología de los indicadores</w:t>
+        <w:t>2. Metodología de los indicadores</w:t>
       </w:r>
     </w:p>
     <w:tbl>
@@ -1491,6 +1302,9 @@
         <w:gridCol w:w="5040"/>
       </w:tblGrid>
       <w:tr>
+        <w:trPr>
+          <w:cantSplit/>
+        </w:trPr>
         <w:tc>
           <w:tcPr>
             <w:tcW w:type="dxa" w:w="5040"/>
@@ -1525,6 +1339,9 @@
         </w:tc>
       </w:tr>
       <w:tr>
+        <w:trPr>
+          <w:cantSplit/>
+        </w:trPr>
         <w:tc>
           <w:tcPr>
             <w:tcW w:type="dxa" w:w="5040"/>
@@ -1553,6 +1370,9 @@
         </w:tc>
       </w:tr>
       <w:tr>
+        <w:trPr>
+          <w:cantSplit/>
+        </w:trPr>
         <w:tc>
           <w:tcPr>
             <w:tcW w:type="dxa" w:w="5040"/>
@@ -1583,6 +1403,9 @@
         </w:tc>
       </w:tr>
       <w:tr>
+        <w:trPr>
+          <w:cantSplit/>
+        </w:trPr>
         <w:tc>
           <w:tcPr>
             <w:tcW w:type="dxa" w:w="5040"/>
@@ -1611,6 +1434,9 @@
         </w:tc>
       </w:tr>
       <w:tr>
+        <w:trPr>
+          <w:cantSplit/>
+        </w:trPr>
         <w:tc>
           <w:tcPr>
             <w:tcW w:type="dxa" w:w="5040"/>
@@ -1736,9 +1562,11 @@
     <w:p>
       <w:pPr>
         <w:pStyle w:val="Ttulo1"/>
+        <w:keepNext/>
+        <w:pageBreakBefore/>
       </w:pPr>
       <w:r>
-        <w:t>Comportamiento mensual de la actividad</w:t>
+        <w:t>3. Comportamiento mensual de la actividad</w:t>
       </w:r>
     </w:p>
     <w:p>
@@ -1748,6 +1576,7 @@
     </w:p>
     <w:p>
       <w:pPr>
+        <w:keepNext/>
         <w:jc w:val="center"/>
       </w:pPr>
       <w:r/>
@@ -1788,9 +1617,15 @@
     </w:p>
     <w:p>
       <w:pPr>
+        <w:pStyle w:val="Descripcin"/>
+        <w:keepNext/>
         <w:jc w:val="center"/>
       </w:pPr>
       <w:r>
+        <w:rPr>
+          <w:i/>
+          <w:sz w:val="20"/>
+        </w:rPr>
         <w:t>Ilustración 1. {{TITULO_GRAFICA_1}}</w:t>
       </w:r>
     </w:p>
@@ -1807,6 +1642,9 @@
         <w:gridCol w:w="2520"/>
       </w:tblGrid>
       <w:tr>
+        <w:trPr>
+          <w:cantSplit/>
+        </w:trPr>
         <w:tc>
           <w:tcPr>
             <w:tcW w:type="dxa" w:w="2520"/>
@@ -1873,6 +1711,9 @@
         </w:tc>
       </w:tr>
       <w:tr>
+        <w:trPr>
+          <w:cantSplit/>
+        </w:trPr>
         <w:tc>
           <w:tcPr>
             <w:tcW w:type="dxa" w:w="2520"/>
@@ -1907,6 +1748,9 @@
         </w:tc>
       </w:tr>
       <w:tr>
+        <w:trPr>
+          <w:cantSplit/>
+        </w:trPr>
         <w:tc>
           <w:tcPr>
             <w:tcW w:type="dxa" w:w="2520"/>
@@ -1945,6 +1789,9 @@
         </w:tc>
       </w:tr>
       <w:tr>
+        <w:trPr>
+          <w:cantSplit/>
+        </w:trPr>
         <w:tc>
           <w:tcPr>
             <w:tcW w:type="dxa" w:w="2520"/>
@@ -1979,6 +1826,9 @@
         </w:tc>
       </w:tr>
       <w:tr>
+        <w:trPr>
+          <w:cantSplit/>
+        </w:trPr>
         <w:tc>
           <w:tcPr>
             <w:tcW w:type="dxa" w:w="2520"/>
@@ -2017,6 +1867,9 @@
         </w:tc>
       </w:tr>
       <w:tr>
+        <w:trPr>
+          <w:cantSplit/>
+        </w:trPr>
         <w:tc>
           <w:tcPr>
             <w:tcW w:type="dxa" w:w="2520"/>
@@ -2054,17 +1907,16 @@
     <w:p>
       <w:pPr>
         <w:pStyle w:val="Ttulo1"/>
+        <w:keepNext/>
+        <w:pageBreakBefore/>
         <w:numPr>
           <w:ilvl w:val="0"/>
           <w:numId w:val="2"/>
         </w:numPr>
       </w:pPr>
-      <w:bookmarkStart w:id="2" w:name="_Toc109393329"/>
       <w:r>
-        <w:lastRenderedPageBreak/>
-        <w:t>Docentes</w:t>
+        <w:t>4. Docentes</w:t>
       </w:r>
-      <w:bookmarkEnd w:id="2"/>
     </w:p>
     <w:p>
       <w:pPr>
@@ -2136,6 +1988,7 @@
     </w:p>
     <w:p>
       <w:pPr>
+        <w:keepNext/>
         <w:ind w:left="360"/>
         <w:jc w:val="center"/>
       </w:pPr>
@@ -2179,6 +2032,8 @@
     </w:p>
     <w:p>
       <w:pPr>
+        <w:pStyle w:val="Descripcin"/>
+        <w:keepNext/>
         <w:pBdr>
           <w:top w:val="nil"/>
           <w:left w:val="nil"/>
@@ -2196,6 +2051,10 @@
         </w:rPr>
       </w:pPr>
       <w:r>
+        <w:rPr>
+          <w:i/>
+          <w:sz w:val="20"/>
+        </w:rPr>
         <w:t>Ilustración 2. {{TITULO_GRAFICA_2}}</w:t>
       </w:r>
     </w:p>
@@ -2216,6 +2075,9 @@
         <w:gridCol w:w="3360"/>
       </w:tblGrid>
       <w:tr>
+        <w:trPr>
+          <w:cantSplit/>
+        </w:trPr>
         <w:tc>
           <w:tcPr>
             <w:tcW w:type="dxa" w:w="3360"/>
@@ -2266,6 +2128,9 @@
         </w:tc>
       </w:tr>
       <w:tr>
+        <w:trPr>
+          <w:cantSplit/>
+        </w:trPr>
         <w:tc>
           <w:tcPr>
             <w:tcW w:type="dxa" w:w="3360"/>
@@ -2292,6 +2157,9 @@
         </w:tc>
       </w:tr>
       <w:tr>
+        <w:trPr>
+          <w:cantSplit/>
+        </w:trPr>
         <w:tc>
           <w:tcPr>
             <w:tcW w:type="dxa" w:w="3360"/>
@@ -2321,6 +2189,9 @@
         </w:tc>
       </w:tr>
       <w:tr>
+        <w:trPr>
+          <w:cantSplit/>
+        </w:trPr>
         <w:tc>
           <w:tcPr>
             <w:tcW w:type="dxa" w:w="3360"/>
@@ -2347,6 +2218,9 @@
         </w:tc>
       </w:tr>
       <w:tr>
+        <w:trPr>
+          <w:cantSplit/>
+        </w:trPr>
         <w:tc>
           <w:tcPr>
             <w:tcW w:type="dxa" w:w="3360"/>
@@ -2376,6 +2250,9 @@
         </w:tc>
       </w:tr>
       <w:tr>
+        <w:trPr>
+          <w:cantSplit/>
+        </w:trPr>
         <w:tc>
           <w:tcPr>
             <w:tcW w:type="dxa" w:w="3360"/>
@@ -2402,6 +2279,9 @@
         </w:tc>
       </w:tr>
       <w:tr>
+        <w:trPr>
+          <w:cantSplit/>
+        </w:trPr>
         <w:tc>
           <w:tcPr>
             <w:tcW w:type="dxa" w:w="3360"/>
@@ -2434,17 +2314,16 @@
     <w:p>
       <w:pPr>
         <w:pStyle w:val="Ttulo1"/>
+        <w:keepNext/>
+        <w:pageBreakBefore/>
         <w:numPr>
           <w:ilvl w:val="0"/>
           <w:numId w:val="2"/>
         </w:numPr>
       </w:pPr>
-      <w:bookmarkStart w:id="5" w:name="_Toc109393330"/>
       <w:r>
-        <w:lastRenderedPageBreak/>
-        <w:t>Estudiantes</w:t>
+        <w:t>5. Estudiantes</w:t>
       </w:r>
-      <w:bookmarkEnd w:id="5"/>
     </w:p>
     <w:p>
       <w:pPr>
@@ -2537,6 +2416,7 @@
     </w:p>
     <w:p>
       <w:pPr>
+        <w:keepNext/>
         <w:jc w:val="center"/>
       </w:pPr>
       <w:r>
@@ -2579,6 +2459,8 @@
     </w:p>
     <w:p>
       <w:pPr>
+        <w:pStyle w:val="Descripcin"/>
+        <w:keepNext/>
         <w:pBdr>
           <w:top w:val="nil"/>
           <w:left w:val="nil"/>
@@ -2596,6 +2478,10 @@
         </w:rPr>
       </w:pPr>
       <w:r>
+        <w:rPr>
+          <w:i/>
+          <w:sz w:val="20"/>
+        </w:rPr>
         <w:t>Ilustración 3. {{TITULO_GRAFICA_3}}</w:t>
       </w:r>
     </w:p>
@@ -2620,6 +2506,7 @@
     </w:p>
     <w:p>
       <w:pPr>
+        <w:keepNext/>
         <w:jc w:val="center"/>
       </w:pPr>
       <w:r>
@@ -2662,6 +2549,8 @@
     </w:p>
     <w:p>
       <w:pPr>
+        <w:pStyle w:val="Descripcin"/>
+        <w:keepNext/>
         <w:pBdr>
           <w:top w:val="nil"/>
           <w:left w:val="nil"/>
@@ -2679,24 +2568,31 @@
         </w:rPr>
       </w:pPr>
       <w:r>
+        <w:rPr>
+          <w:i/>
+          <w:sz w:val="20"/>
+        </w:rPr>
         <w:t>Ilustración 4. {{TITULO_GRAFICA_4}}</w:t>
       </w:r>
     </w:p>
     <w:p>
       <w:pPr>
         <w:pStyle w:val="Ttulo1"/>
+        <w:keepNext/>
+        <w:pageBreakBefore/>
       </w:pPr>
       <w:r>
-        <w:t>Cursos destacados</w:t>
+        <w:t>6. Cursos destacados</w:t>
       </w:r>
     </w:p>
     <w:p>
       <w:r>
-        <w:t>La comparación por eventos estudiantiles permite identificar los cursos con mayor volumen de interacción. Este indicador se presenta de forma separada de estudiantes únicos y días activos para evitar interpretaciones ambiguas.</w:t>
+        <w:t>La comparación se presenta por días activos para identificar los cursos con mayor continuidad estudiantil. Los eventos y estudiantes únicos se mantienen como indicadores complementarios.</w:t>
       </w:r>
     </w:p>
     <w:p>
       <w:pPr>
+        <w:keepNext/>
         <w:jc w:val="center"/>
       </w:pPr>
       <w:r/>
@@ -2737,9 +2633,15 @@
     </w:p>
     <w:p>
       <w:pPr>
+        <w:pStyle w:val="Descripcin"/>
+        <w:keepNext/>
         <w:jc w:val="center"/>
       </w:pPr>
       <w:r>
+        <w:rPr>
+          <w:i/>
+          <w:sz w:val="20"/>
+        </w:rPr>
         <w:t>Ilustración 5. {{TITULO_GRAFICA_5}}</w:t>
       </w:r>
     </w:p>
@@ -2756,6 +2658,9 @@
         <w:gridCol w:w="2520"/>
       </w:tblGrid>
       <w:tr>
+        <w:trPr>
+          <w:cantSplit/>
+        </w:trPr>
         <w:tc>
           <w:tcPr>
             <w:tcW w:type="dxa" w:w="2520"/>
@@ -2822,6 +2727,9 @@
         </w:tc>
       </w:tr>
       <w:tr>
+        <w:trPr>
+          <w:cantSplit/>
+        </w:trPr>
         <w:tc>
           <w:tcPr>
             <w:tcW w:type="dxa" w:w="2520"/>
@@ -2856,6 +2764,9 @@
         </w:tc>
       </w:tr>
       <w:tr>
+        <w:trPr>
+          <w:cantSplit/>
+        </w:trPr>
         <w:tc>
           <w:tcPr>
             <w:tcW w:type="dxa" w:w="2520"/>
@@ -2894,6 +2805,9 @@
         </w:tc>
       </w:tr>
       <w:tr>
+        <w:trPr>
+          <w:cantSplit/>
+        </w:trPr>
         <w:tc>
           <w:tcPr>
             <w:tcW w:type="dxa" w:w="2520"/>
@@ -2928,6 +2842,9 @@
         </w:tc>
       </w:tr>
       <w:tr>
+        <w:trPr>
+          <w:cantSplit/>
+        </w:trPr>
         <w:tc>
           <w:tcPr>
             <w:tcW w:type="dxa" w:w="2520"/>
@@ -2966,6 +2883,9 @@
         </w:tc>
       </w:tr>
       <w:tr>
+        <w:trPr>
+          <w:cantSplit/>
+        </w:trPr>
         <w:tc>
           <w:tcPr>
             <w:tcW w:type="dxa" w:w="2520"/>
@@ -3000,6 +2920,9 @@
         </w:tc>
       </w:tr>
       <w:tr>
+        <w:trPr>
+          <w:cantSplit/>
+        </w:trPr>
         <w:tc>
           <w:tcPr>
             <w:tcW w:type="dxa" w:w="2520"/>
@@ -3040,37 +2963,18 @@
     </w:tbl>
     <w:p>
       <w:pPr>
-        <w:spacing w:line="259" w:lineRule="auto"/>
-        <w:rPr>
-          <w:b/>
-        </w:rPr>
-      </w:pPr>
-      <w:r>
-        <w:br w:type="page"/>
-      </w:r>
-    </w:p>
-    <w:p>
-      <w:pPr>
         <w:pStyle w:val="Ttulo1"/>
-        <w:spacing w:after="200" w:line="240" w:lineRule="auto"/>
-        <w:ind w:left="720"/>
-        <w:jc w:val="left"/>
-      </w:pPr>
-    </w:p>
-    <w:p>
-      <w:pPr>
-        <w:pStyle w:val="Ttulo1"/>
+        <w:keepNext/>
+        <w:pageBreakBefore/>
         <w:numPr>
           <w:ilvl w:val="0"/>
           <w:numId w:val="2"/>
         </w:numPr>
         <w:spacing w:after="200" w:line="240" w:lineRule="auto"/>
       </w:pPr>
-      <w:bookmarkStart w:id="8" w:name="_Toc109393331"/>
       <w:r>
-        <w:t>Diseño de cursos virtuales</w:t>
+        <w:t>7. Diseño de cursos virtuales</w:t>
       </w:r>
-      <w:bookmarkEnd w:id="8"/>
     </w:p>
     <w:p>
       <w:pPr>
@@ -3126,6 +3030,8 @@
     </w:p>
     <w:p>
       <w:pPr>
+        <w:pStyle w:val="Descripcin"/>
+        <w:keepNext/>
         <w:pBdr>
           <w:top w:val="nil"/>
           <w:left w:val="nil"/>
@@ -3143,6 +3049,10 @@
         </w:rPr>
       </w:pPr>
       <w:r>
+        <w:rPr>
+          <w:i/>
+          <w:sz w:val="20"/>
+        </w:rPr>
         <w:t>Ilustración 6. {{TITULO_GRAFICA_6}}</w:t>
       </w:r>
     </w:p>
@@ -4411,6 +4321,19 @@
       <w:color w:val="666666"/>
       <w:sz w:val="48"/>
       <w:szCs w:val="48"/>
+    </w:rPr>
+  </w:style>
+  <w:style w:type="paragraph" w:customStyle="1" w:styleId="TableofFigures">
+    <w:name w:val="Table of Figures"/>
+    <w:pPr>
+      <w:tabs>
+        <w:tab w:pos="9216" w:val="right"/>
+      </w:tabs>
+      <w:spacing w:after="180" w:line="276" w:lineRule="auto"/>
+    </w:pPr>
+    <w:rPr>
+      <w:rFonts w:ascii="Times New Roman" w:hAnsi="Times New Roman"/>
+      <w:sz w:val="24"/>
     </w:rPr>
   </w:style>
 </w:styles>

</xml_diff>

<commit_message>
feat: igualar tabla de contenido a la estructura de tabla de ilustraciones
</commit_message>
<xml_diff>
--- a/templates/PLANTILLA_INFORME.docx
+++ b/templates/PLANTILLA_INFORME.docx
@@ -483,430 +483,26 @@
         </w:rPr>
       </w:pPr>
     </w:p>
-    <w:sdt>
-      <w:sdtPr>
-        <w:id w:val="-1219273720"/>
-        <w:docPartObj>
-          <w:docPartGallery w:val="Table of Contents"/>
-          <w:docPartUnique/>
-        </w:docPartObj>
-      </w:sdtPr>
-      <w:sdtEndPr/>
-      <w:sdtContent>
-        <w:p>
-          <w:pPr>
-            <w:pStyle w:val="TDC1"/>
-            <w:tabs>
-              <w:tab w:val="right" w:pos="10070"/>
-            </w:tabs>
-            <w:rPr>
-              <w:rFonts w:asciiTheme="minorHAnsi" w:eastAsiaTheme="minorEastAsia" w:hAnsiTheme="minorHAnsi" w:cstheme="minorBidi"/>
-              <w:noProof/>
-              <w:lang w:eastAsia="es-MX"/>
-            </w:rPr>
-          </w:pPr>
-          <w:r>
-            <w:fldChar w:fldCharType="begin"/>
-          </w:r>
-          <w:r>
-            <w:instrText xml:space="preserve"> TOC \h \u \z </w:instrText>
-          </w:r>
-          <w:r>
-            <w:fldChar w:fldCharType="separate"/>
-          </w:r>
-          <w:hyperlink w:anchor="_Toc109393327" w:history="1">
-            <w:r>
-              <w:rPr>
-                <w:rStyle w:val="Hipervnculo"/>
-                <w:noProof/>
-              </w:rPr>
-              <w:t>Resumen Ejecutivo</w:t>
-            </w:r>
-            <w:r>
-              <w:rPr>
-                <w:noProof/>
-                <w:webHidden/>
-              </w:rPr>
-              <w:tab/>
-            </w:r>
-            <w:r>
-              <w:rPr>
-                <w:noProof/>
-                <w:webHidden/>
-              </w:rPr>
-              <w:fldChar w:fldCharType="begin"/>
-            </w:r>
-            <w:r>
-              <w:rPr>
-                <w:noProof/>
-                <w:webHidden/>
-              </w:rPr>
-              <w:instrText xml:space="preserve"> PAGEREF _Toc109393327 \h </w:instrText>
-            </w:r>
-            <w:r>
-              <w:rPr>
-                <w:noProof/>
-                <w:webHidden/>
-              </w:rPr>
-            </w:r>
-            <w:r>
-              <w:rPr>
-                <w:noProof/>
-                <w:webHidden/>
-              </w:rPr>
-              <w:fldChar w:fldCharType="separate"/>
-            </w:r>
-            <w:r>
-              <w:rPr>
-                <w:noProof/>
-                <w:webHidden/>
-              </w:rPr>
-              <w:t>4</w:t>
-            </w:r>
-            <w:r>
-              <w:rPr>
-                <w:noProof/>
-                <w:webHidden/>
-              </w:rPr>
-              <w:fldChar w:fldCharType="end"/>
-            </w:r>
-          </w:hyperlink>
-        </w:p>
-        <w:p>
-          <w:pPr>
-            <w:pStyle w:val="TDC1"/>
-            <w:tabs>
-              <w:tab w:val="right" w:pos="10070"/>
-            </w:tabs>
-            <w:rPr>
-              <w:rFonts w:asciiTheme="minorHAnsi" w:eastAsiaTheme="minorEastAsia" w:hAnsiTheme="minorHAnsi" w:cstheme="minorBidi"/>
-              <w:noProof/>
-              <w:lang w:eastAsia="es-MX"/>
-            </w:rPr>
-          </w:pPr>
-          <w:hyperlink w:anchor="_Toc109393328" w:history="1">
-            <w:r>
-              <w:rPr>
-                <w:rStyle w:val="Hipervnculo"/>
-                <w:noProof/>
-              </w:rPr>
-              <w:t>Introducción</w:t>
-            </w:r>
-            <w:r>
-              <w:rPr>
-                <w:noProof/>
-                <w:webHidden/>
-              </w:rPr>
-              <w:tab/>
-            </w:r>
-            <w:r>
-              <w:rPr>
-                <w:noProof/>
-                <w:webHidden/>
-              </w:rPr>
-              <w:fldChar w:fldCharType="begin"/>
-            </w:r>
-            <w:r>
-              <w:rPr>
-                <w:noProof/>
-                <w:webHidden/>
-              </w:rPr>
-              <w:instrText xml:space="preserve"> PAGEREF _Toc109393328 \h </w:instrText>
-            </w:r>
-            <w:r>
-              <w:rPr>
-                <w:noProof/>
-                <w:webHidden/>
-              </w:rPr>
-            </w:r>
-            <w:r>
-              <w:rPr>
-                <w:noProof/>
-                <w:webHidden/>
-              </w:rPr>
-              <w:fldChar w:fldCharType="separate"/>
-            </w:r>
-            <w:r>
-              <w:rPr>
-                <w:noProof/>
-                <w:webHidden/>
-              </w:rPr>
-              <w:t>5</w:t>
-            </w:r>
-            <w:r>
-              <w:rPr>
-                <w:noProof/>
-                <w:webHidden/>
-              </w:rPr>
-              <w:fldChar w:fldCharType="end"/>
-            </w:r>
-          </w:hyperlink>
-        </w:p>
-        <w:p>
-          <w:pPr>
-            <w:pStyle w:val="TDC1"/>
-            <w:tabs>
-              <w:tab w:val="left" w:pos="480"/>
-              <w:tab w:val="right" w:pos="10070"/>
-            </w:tabs>
-            <w:rPr>
-              <w:rFonts w:asciiTheme="minorHAnsi" w:eastAsiaTheme="minorEastAsia" w:hAnsiTheme="minorHAnsi" w:cstheme="minorBidi"/>
-              <w:noProof/>
-              <w:lang w:eastAsia="es-MX"/>
-            </w:rPr>
-          </w:pPr>
-          <w:hyperlink w:anchor="_Toc109393329" w:history="1">
-            <w:r>
-              <w:rPr>
-                <w:rStyle w:val="Hipervnculo"/>
-                <w:noProof/>
-              </w:rPr>
-              <w:t>1.</w:t>
-            </w:r>
-            <w:r>
-              <w:rPr>
-                <w:rFonts w:asciiTheme="minorHAnsi" w:eastAsiaTheme="minorEastAsia" w:hAnsiTheme="minorHAnsi" w:cstheme="minorBidi"/>
-                <w:noProof/>
-                <w:lang w:eastAsia="es-MX"/>
-              </w:rPr>
-              <w:tab/>
-            </w:r>
-            <w:r>
-              <w:rPr>
-                <w:rStyle w:val="Hipervnculo"/>
-                <w:noProof/>
-              </w:rPr>
-              <w:t>Docentes</w:t>
-            </w:r>
-            <w:r>
-              <w:rPr>
-                <w:noProof/>
-                <w:webHidden/>
-              </w:rPr>
-              <w:tab/>
-            </w:r>
-            <w:r>
-              <w:rPr>
-                <w:noProof/>
-                <w:webHidden/>
-              </w:rPr>
-              <w:fldChar w:fldCharType="begin"/>
-            </w:r>
-            <w:r>
-              <w:rPr>
-                <w:noProof/>
-                <w:webHidden/>
-              </w:rPr>
-              <w:instrText xml:space="preserve"> PAGEREF _Toc109393329 \h </w:instrText>
-            </w:r>
-            <w:r>
-              <w:rPr>
-                <w:noProof/>
-                <w:webHidden/>
-              </w:rPr>
-            </w:r>
-            <w:r>
-              <w:rPr>
-                <w:noProof/>
-                <w:webHidden/>
-              </w:rPr>
-              <w:fldChar w:fldCharType="separate"/>
-            </w:r>
-            <w:r>
-              <w:rPr>
-                <w:noProof/>
-                <w:webHidden/>
-              </w:rPr>
-              <w:t>7</w:t>
-            </w:r>
-            <w:r>
-              <w:rPr>
-                <w:noProof/>
-                <w:webHidden/>
-              </w:rPr>
-              <w:fldChar w:fldCharType="end"/>
-            </w:r>
-          </w:hyperlink>
-        </w:p>
-        <w:p>
-          <w:pPr>
-            <w:pStyle w:val="TDC1"/>
-            <w:tabs>
-              <w:tab w:val="left" w:pos="480"/>
-              <w:tab w:val="right" w:pos="10070"/>
-            </w:tabs>
-            <w:rPr>
-              <w:rFonts w:asciiTheme="minorHAnsi" w:eastAsiaTheme="minorEastAsia" w:hAnsiTheme="minorHAnsi" w:cstheme="minorBidi"/>
-              <w:noProof/>
-              <w:lang w:eastAsia="es-MX"/>
-            </w:rPr>
-          </w:pPr>
-          <w:hyperlink w:anchor="_Toc109393330" w:history="1">
-            <w:r>
-              <w:rPr>
-                <w:rStyle w:val="Hipervnculo"/>
-                <w:noProof/>
-              </w:rPr>
-              <w:t>2.</w:t>
-            </w:r>
-            <w:r>
-              <w:rPr>
-                <w:rFonts w:asciiTheme="minorHAnsi" w:eastAsiaTheme="minorEastAsia" w:hAnsiTheme="minorHAnsi" w:cstheme="minorBidi"/>
-                <w:noProof/>
-                <w:lang w:eastAsia="es-MX"/>
-              </w:rPr>
-              <w:tab/>
-            </w:r>
-            <w:r>
-              <w:rPr>
-                <w:rStyle w:val="Hipervnculo"/>
-                <w:noProof/>
-              </w:rPr>
-              <w:t>Estudiantes</w:t>
-            </w:r>
-            <w:r>
-              <w:rPr>
-                <w:noProof/>
-                <w:webHidden/>
-              </w:rPr>
-              <w:tab/>
-            </w:r>
-            <w:r>
-              <w:rPr>
-                <w:noProof/>
-                <w:webHidden/>
-              </w:rPr>
-              <w:fldChar w:fldCharType="begin"/>
-            </w:r>
-            <w:r>
-              <w:rPr>
-                <w:noProof/>
-                <w:webHidden/>
-              </w:rPr>
-              <w:instrText xml:space="preserve"> PAGEREF _Toc109393330 \h </w:instrText>
-            </w:r>
-            <w:r>
-              <w:rPr>
-                <w:noProof/>
-                <w:webHidden/>
-              </w:rPr>
-            </w:r>
-            <w:r>
-              <w:rPr>
-                <w:noProof/>
-                <w:webHidden/>
-              </w:rPr>
-              <w:fldChar w:fldCharType="separate"/>
-            </w:r>
-            <w:r>
-              <w:rPr>
-                <w:noProof/>
-                <w:webHidden/>
-              </w:rPr>
-              <w:t>8</w:t>
-            </w:r>
-            <w:r>
-              <w:rPr>
-                <w:noProof/>
-                <w:webHidden/>
-              </w:rPr>
-              <w:fldChar w:fldCharType="end"/>
-            </w:r>
-          </w:hyperlink>
-        </w:p>
-        <w:p>
-          <w:pPr>
-            <w:pStyle w:val="TDC1"/>
-            <w:tabs>
-              <w:tab w:val="left" w:pos="480"/>
-              <w:tab w:val="right" w:pos="10070"/>
-            </w:tabs>
-            <w:rPr>
-              <w:rFonts w:asciiTheme="minorHAnsi" w:eastAsiaTheme="minorEastAsia" w:hAnsiTheme="minorHAnsi" w:cstheme="minorBidi"/>
-              <w:noProof/>
-              <w:lang w:eastAsia="es-MX"/>
-            </w:rPr>
-          </w:pPr>
-          <w:hyperlink w:anchor="_Toc109393331" w:history="1">
-            <w:r>
-              <w:rPr>
-                <w:rStyle w:val="Hipervnculo"/>
-                <w:noProof/>
-              </w:rPr>
-              <w:t>3.</w:t>
-            </w:r>
-            <w:r>
-              <w:rPr>
-                <w:rFonts w:asciiTheme="minorHAnsi" w:eastAsiaTheme="minorEastAsia" w:hAnsiTheme="minorHAnsi" w:cstheme="minorBidi"/>
-                <w:noProof/>
-                <w:lang w:eastAsia="es-MX"/>
-              </w:rPr>
-              <w:tab/>
-            </w:r>
-            <w:r>
-              <w:rPr>
-                <w:rStyle w:val="Hipervnculo"/>
-                <w:noProof/>
-              </w:rPr>
-              <w:t>Diseño de cursos virtuales</w:t>
-            </w:r>
-            <w:r>
-              <w:rPr>
-                <w:noProof/>
-                <w:webHidden/>
-              </w:rPr>
-              <w:tab/>
-            </w:r>
-            <w:r>
-              <w:rPr>
-                <w:noProof/>
-                <w:webHidden/>
-              </w:rPr>
-              <w:fldChar w:fldCharType="begin"/>
-            </w:r>
-            <w:r>
-              <w:rPr>
-                <w:noProof/>
-                <w:webHidden/>
-              </w:rPr>
-              <w:instrText xml:space="preserve"> PAGEREF _Toc109393331 \h </w:instrText>
-            </w:r>
-            <w:r>
-              <w:rPr>
-                <w:noProof/>
-                <w:webHidden/>
-              </w:rPr>
-            </w:r>
-            <w:r>
-              <w:rPr>
-                <w:noProof/>
-                <w:webHidden/>
-              </w:rPr>
-              <w:fldChar w:fldCharType="separate"/>
-            </w:r>
-            <w:r>
-              <w:rPr>
-                <w:noProof/>
-                <w:webHidden/>
-              </w:rPr>
-              <w:t>10</w:t>
-            </w:r>
-            <w:r>
-              <w:rPr>
-                <w:noProof/>
-                <w:webHidden/>
-              </w:rPr>
-              <w:fldChar w:fldCharType="end"/>
-            </w:r>
-          </w:hyperlink>
-        </w:p>
-        <w:p>
-          <w:r>
-            <w:fldChar w:fldCharType="end"/>
-          </w:r>
-        </w:p>
-      </w:sdtContent>
-    </w:sdt>
+    <w:p>
+      <w:pPr>
+        <w:pStyle w:val="Normal"/>
+      </w:pPr>
+      <w:r>
+        <w:fldChar w:fldCharType="begin" w:dirty="true"/>
+      </w:r>
+      <w:r>
+        <w:instrText xml:space="preserve"> TOC \h \z \u </w:instrText>
+      </w:r>
+      <w:r>
+        <w:fldChar w:fldCharType="separate"/>
+      </w:r>
+      <w:r>
+        <w:t>La tabla de contenido se actualizará al abrir el documento.</w:t>
+      </w:r>
+      <w:r>
+        <w:fldChar w:fldCharType="end"/>
+      </w:r>
+    </w:p>
     <w:p>
       <w:pPr>
         <w:spacing w:line="259" w:lineRule="auto"/>

</xml_diff>